<commit_message>
Proofcheck Inn Trouble German: MINOR (26 edits)
Co-Authored-By: Claude Opus 5.5 <noreply@anthropic.com>
Claude-Session: https://claude.ai/code/session_012Cm8JxdqzjuttdUSdkQCUg
</commit_message>
<xml_diff>
--- a/translated/corrected/Inn Trouble - ASSEMBLED - FORMATTED_German.docx
+++ b/translated/corrected/Inn Trouble - ASSEMBLED - FORMATTED_German.docx
@@ -641,7 +641,7 @@
     </w:p>
     <w:p>
       <w:r>
-        <w:t xml:space="preserve">»Jahre.« Sie wischte sich mit dem Handrücken über die Augen, eine kindliche Geste. »Ich habe es gefunden, nachdem meine Mutter gestorben war. Es gab einen Koffer auf dem Dachboden, einen alten Reisekoffer, verschlossen, und der Schlüssel lag in den Sachen meiner Mutter mit einem Zettel daran in ihrer Handschrift, auf dem einfach nur </w:t>
+        <w:t xml:space="preserve">»Jahre.« Sie wischte sich mit dem Handrücken über die Augen, eine kindliche Geste. »Ich habe es gefunden, nachdem meine Mutter gestorben war. Es gab einen Koffer auf dem Dachboden, einen alten Reisekoffer, verschlossen, und der Schlüssel lag in den Sachen meiner Mutter mit einem Anhänger daran in ihrer Handschrift, auf dem einfach nur </w:t>
       </w:r>
       <w:r>
         <w:rPr>
@@ -1137,7 +1137,7 @@
     </w:p>
     <w:p>
       <w:r>
-        <w:t>»Ich muss ein Bedauern gestehen.« Er rieb sich reuigen Blickens den Nacken, und die Leute neigten sich ihm zugewandt und voll Zuneigung zu. Jeder liebte Theo, wenn er so war. »Wir sind nicht ganz komplett. Einige der Blackburn-Briefe, ein paar der interessantesten, genau die, die ich Ihnen allen am liebsten gezeigt hätte, sind beim Sortieren abhanden gekommen. Falsch einsortiert, ganz bestimmt, nicht verloren; solche Sachen tauchen immer genau an dem Tag wieder auf, an dem man aufhört danach zu suchen. Aber sie befinden sich eben nicht in der Vitrine, und ich wollte sie unbedingt dorthin haben, und ich fürchte, der Fehler liegt an meiner eigenen schlampigen Ordnung.« Er breitete die Hände aus, und sein Lächeln wurde selbstironisch. »Ein Historiker, der seine eigenen Briefe nicht finden kann. Tja. Erzählen Sie es bloß nicht dem Bewilligungsausschuss.«</w:t>
+        <w:t xml:space="preserve">»Ich muss ein Bedauern gestehen.« Er rieb sich reuigen Blickens den Nacken, und die Leute neigten sich ihm zugewandt und voll Zuneigung zu. Jeder liebte Theo, wenn er so war. »Wir sind nicht ganz komplett. Einige der Blackburn-Briefe, ein paar der interessantesten, genau die, die ich Ihnen allen am liebsten gezeigt hätte, sind beim Sortieren abhandengekommen. Falsch einsortiert, ganz bestimmt, nicht verloren; solche Sachen tauchen immer genau an dem Tag wieder auf, an dem man aufhört danach zu suchen. Aber sie befinden sich eben nicht in der Vitrine, und ich wollte sie unbedingt dorthin haben, und ich fürchte, der Fehler liegt an meiner eigenen schlampigen Ordnung.« Er breitete die Hände aus, und sein Lächeln wurde selbstironisch. »Ein Historiker, der seine eigenen Briefe nicht finden kann. Tja. Erzählen Sie es bloß nicht dem Bewilligungsausschuss.«</w:t>
       </w:r>
     </w:p>
     <w:p>
@@ -1152,7 +1152,7 @@
     </w:p>
     <w:p>
       <w:r>
-        <w:t>Ich lachte nicht. Ich stand stumm mitten in dem warmen, lachenden Raum und spürte, wie die Kälte in mir aufstieg, denn die interessantesten Briefe der Blackburns – jene, die aussagen würden, dass eine Brosche verschwunden war und wo sie gelandet war – waren abhanden gekommen. Und tief in der Innentasche meines Mantels steckte ein Erpresserzettel, der genau wusste, was in diesen Briefen stand.</w:t>
+        <w:t xml:space="preserve">Ich lachte nicht. Ich stand stumm mitten in dem warmen, lachenden Raum und spürte, wie die Kälte in mir aufstieg, denn die interessantesten Briefe der Blackburns – jene, die aussagen würden, dass eine Brosche verschwunden war und wo sie gelandet war – waren abhandengekommen. Und tief in der Innentasche meines Mantels steckte ein Erpresserzettel, der genau wusste, was in diesen Briefen stand.</w:t>
       </w:r>
     </w:p>
     <w:p>
@@ -1212,7 +1212,7 @@
     </w:p>
     <w:p>
       <w:r>
-        <w:t xml:space="preserve">Yarn Tales lag an der Ecke von Evergreen und Maple, und sein Schaufenster war voller Wollstränge, die nach Farben gestapelt waren wie ein geöffneter Farbkasten. Drinnen war es warm und schummrig. Es roch nach Wolle und nach der Kamille, die Olivia immer auf der kleinen Heizplatte hinter der Theke ziehen ließ. Der Strickkreis hatte an diesem Nachmittag ihre Stühle weit nach vorn gezogen, in das wässrige Oktoberlicht aus dem Fenster, und sie waren alle da. Olivia saß natürlich mittendrin, denn es war ihr Laden, ihre Kamille und irgendwie immer ihre Gesprächsführung; Dot saß neben ihr, stämmig und grau, trocken wie Zwieback; Claire mit ihrer schnellen Reporterauffassungsgabe, die den anderen schon drei Reihen voraus war; Ivy, die über Witze lachte, bevor sie überhaupt richtig fertig waren; Martha, aufrecht im guten Sessel mit übergeschlagenen Fußgelenken; und Ellie, die sanfte Ellie, die über einer fallen gelassenen Masche die Stirn in Falten legte.</w:t>
+        <w:t xml:space="preserve">Yarn Tales lag an der Ecke von Evergreen und Maple, und sein Schaufenster war voller Wollstränge, die nach Farben gestapelt waren wie ein geöffneter Farbkasten. Drinnen war es warm und schummrig. Es roch nach Wolle und nach der Kamille, die Olivia immer auf der kleinen Heizplatte hinter der Theke ziehen ließ. Der Strickkreis hatte an diesem Nachmittag seine Stühle weit nach vorn gezogen, in das wässrige Oktoberlicht aus dem Fenster, und sie waren alle da. Olivia saß natürlich mittendrin, denn es war ihr Laden, ihre Kamille und irgendwie immer ihre Gesprächsführung; Dot saß neben ihr, stämmig und grau, trocken wie Zwieback; Claire mit ihrer schnellen Reporterauffassungsgabe, die den anderen schon drei Reihen voraus war; Ivy, die über Witze lachte, bevor sie überhaupt richtig fertig waren; Martha, aufrecht im guten Sessel mit übergeschlagenen Fußgelenken; und Ellie, die sanfte Ellie, die über einer fallen gelassenen Masche die Stirn in Falten legte.</w:t>
       </w:r>
     </w:p>
     <w:p>
@@ -1382,7 +1382,7 @@
     </w:p>
     <w:p>
       <w:r>
-        <w:t>Fünfhunderttausend Dollar, gefordert von einer Frau, die nicht einmal ein Zehntel davon besaß, von jemandem, der genau wusste, wie man aus einem alten Geheimnis ein Vermögen herbeizauberte. Ein Gebäude voller Erinnerungen der Stadt, das im Dunkeln zu versinken drohte, weil ein Bruchteil eben dieser Summe fehlte. Und ein guter, grau im Gesicht gewordener Mann, der keine ehrliche Tür mehr fand, an die er klopfen konnte.</w:t>
+        <w:t xml:space="preserve">Fünfhunderttausend Dollar, einer Frau abverlangt, die nicht einmal ein Zehntel davon besaß, von jemandem, der genau wusste, wie man aus einem alten Geheimnis ein Vermögen herbeizauberte. Ein Gebäude voller Erinnerungen der Stadt, das im Dunkeln zu versinken drohte, weil ein Bruchteil eben dieser Summe fehlte. Und ein guter, grau im Gesicht gewordener Mann, der keine ehrliche Tür mehr fand, an die er klopfen konnte.</w:t>
       </w:r>
     </w:p>
     <w:p>
@@ -2835,7 +2835,7 @@
     <w:p/>
     <w:p>
       <w:r>
-        <w:t>»Sam hatte überhaupt keine Gelegenheit. Er hat noch nie einen Fuß ins Archiv gesetzt, sagt, Staub bringt ihn zum Niesen, und auch das glaube ich ihm. Er hat mir erzählt, die alten Familien seien Theos Abteilung, und das hat er ernst gemeint.« Ich tippte mit dem Finger auf das Blatt. »Der Geruch nach Schmiede hat ihn auf die Liste gebracht, und ich glaube, genau dieser Geruch wird ihn wieder von ihr herunterbringen, denn Pip erzählt mir seit der ersten Nacht, dass der Notizzettel nach dem Ort riecht, an dem Sams Eisen ist, nicht nach Sam. Und Sams Eisen zieht sich durch Fionas gesamte Lobby. Alles, was in dieser Lobby zurückbleibt, riecht am Ende nach seinem Feuer. Einfach alles.«</w:t>
+        <w:t xml:space="preserve">»Sam hatte überhaupt keine Gelegenheit. Er hat noch nie einen Fuß ins Archiv gesetzt, sagt, Staub bringt ihn zum Niesen, und auch das glaube ich ihm. Er hat mir erzählt, die alten Familien seien Theos Abteilung, und das hat er ernst gemeint.« Ich tippte mit dem Finger auf das Blatt. »Der Geruch nach Schmiede hat ihn auf die Liste gebracht, und ich glaube, genau dieser Geruch wird ihn wieder von ihr herunterbringen, denn Pip erzählt mir seit der ersten Nacht, dass der Zettel nach dem Ort riecht, an dem Sams Eisen ist, nicht nach Sam. Und Sams Eisen zieht sich durch Fionas gesamte Lobby. Alles, was in dieser Lobby zurückbleibt, riecht am Ende nach seinem Feuer. Einfach alles.«</w:t>
       </w:r>
     </w:p>
     <w:p/>
@@ -2871,7 +2871,7 @@
     <w:p/>
     <w:p>
       <w:r>
-        <w:t>»Damit bleiben noch zwei.« Ich sah auf das Papier und wollte es nicht. Vera. Theo. Die beiden Namen, bei denen ich keinen Strich durchziehen konnte. »Und genau das bereitet mir Sorgen. Von allen auf diesem Blatt sind die einzigen zwei, die ich nicht entlasten kann, diejenigen, die die Schlüssel zu den alten Papieren der Stadt hüten. Vera verwaltet die Urkunden und Grundbucheinträge, ein Jahrhundert darüber, wem was gehört hat, und die Urkunde des Gasthofs muss irgendwo dazwischen sein. Sie wurde steif wie ein Besenstiel und versicherte mir, sie lese nie die Papiere, die direkt hinter ihrem Rücken stehen. Und Theo.« Ich zwang mich dazu, es langsam auszusprechen. »Theo wohnt im Archiv. Die Blackburn-Briefe waren in seiner Obhut, in seinen Händen. Und die interessantesten von ihnen, genau die, die besagen würden, dass eine Brosche verschwunden ist und wo sie geblieben ist, sind diejenigen, bei denen er vor der ganzen Stadt aufgestanden ist und verkündet hat, sie seien abhanden gekommen.«</w:t>
+        <w:t xml:space="preserve">»Damit bleiben noch zwei.« Ich sah auf das Papier und wollte es nicht. Vera. Theo. Die beiden Namen, bei denen ich keinen Strich durchziehen konnte. »Und genau das bereitet mir Sorgen. Von allen auf diesem Blatt sind die einzigen zwei, die ich nicht entlasten kann, diejenigen, die die Schlüssel zu den alten Papieren der Stadt hüten. Vera verwaltet die Urkunden und Grundbucheinträge, ein Jahrhundert darüber, wem was gehört hat, und die Urkunde des Gasthofs muss irgendwo dazwischen sein. Sie wurde steif wie ein Besenstiel und versicherte mir, sie lese nie die Papiere, die direkt hinter ihrem Rücken stehen. Und Theo.« Ich zwang mich dazu, es langsam auszusprechen. »Theo wohnt im Archiv. Die Blackburn-Briefe waren in seiner Obhut, in seinen Händen. Und die interessantesten von ihnen, genau die, die besagen würden, dass eine Brosche verschwunden ist und wo sie geblieben ist, sind diejenigen, bei denen er vor der ganzen Stadt aufgestanden ist und verkündet hat, sie seien abhandengekommen.«</w:t>
       </w:r>
     </w:p>
     <w:p/>
@@ -2985,7 +2985,7 @@
     </w:p>
     <w:p>
       <w:r>
-        <w:t>Der Geruch auf dem Zettel war nie Sams gewesen. Es war seine Arbeit gewesen. Ein Schmied vollendet Eisen, indem er Öl hineinbrennt, solange es noch heiß ist, und neue Eisenarbeiten tragen diesen Rauch wochenlang in sich. Fionas Lobby war voll davon, das Treppengeländer, der Kaminschirm, die Winkel, die an der Veranda angebracht wurden, und Sams Mantel und Werkzeugtasche hatten drei Wochen lang jeden Tag an ihrer Tür gehangen. Jedes Papier, das auf diesem Schreibtisch lag, nahm den Geruch an. Der Zettel hatte ebenfalls dort gelegen. Der Hinweis, der ihn ganz nach oben auf meine Liste gebracht hatte, hatte mir die ganze Zeit über verraten, wo der Zettel gewesen war. Nicht, wer ihn geschrieben hatte. Ich hatte ihn rückwärts gelesen. Jetzt konnte ich ihn richtig herum lesen, und richtig herum entlastete er ihn vollständig und rein.</w:t>
+        <w:t xml:space="preserve">Der Geruch auf dem Zettel war nie Sams gewesen. Es war seine Arbeit gewesen. Ein Schmied vollendet Eisen, indem er Öl hineinbrennt, solange es noch heiß ist, und neue Eisenarbeiten tragen diesen Rauch wochenlang in sich. Fionas Lobby war voll davon, das Treppengeländer, der Funkenschirm, die Halterungen, die an der Veranda angebracht wurden, und Sams Mantel und Werkzeugtasche hatten drei Wochen lang jeden Tag an ihrer Tür gehangen. Jedes Papier, das auf diesem Schreibtisch lag, nahm den Geruch an. Der Zettel hatte ebenfalls dort gelegen. Der Hinweis, der ihn ganz nach oben auf meine Liste gebracht hatte, hatte mir die ganze Zeit über verraten, wo der Zettel gewesen war. Nicht, wer ihn geschrieben hatte. Ich hatte ihn rückwärts gelesen. Jetzt konnte ich ihn richtig herum lesen, und richtig herum entlastete er ihn vollständig und rein.</w:t>
       </w:r>
     </w:p>
     <w:p>
@@ -3080,7 +3080,7 @@
     </w:p>
     <w:p>
       <w:r>
-        <w:t>»Sie hatte noch Geld zu bekommen«, sagte Neil und beobachtete mich beim Lesen. »Das ist der Teil, den der Klatsch immer weglässt, weil Klatsch einen sauberen kleinen Bösewicht und ein sauberes kleines Verbrechen will. Die Blackburns hatten ihre Hausangestellten seit Monaten nicht bezahlt, in dem Winter von vierundzwanzig. Ich habe die Beschwerden da drin, die anderen Bediensteten, die hingeworfen haben, und einen Brief, Mrs. Claus, einen Brief von Constance höchstpersönlich, in dem sie ganz höflich um ihren ausstehenden Lohn bittet und als Antwort zu hören bekommt, sie solle dankbar sein, dass sie ein Dach über dem Kopf hat. Ihre Mutter lag im selben Winter drei Straßen weiter im Sterben, und es war kein Geld für einen Arzt da, absolut keines. Und sie stand da, Tag für Tag, und entstaubte eine Brosche, die mehr wert war, als sie in drei Leben verdienen würde, während die Familie, der sie gehörte, ihr sagte, sie solle dankbar sein.« Er breitete die Hände aus. »Ich sage nicht, dass es richtig war, sie mitzunehmen. Ich sage nur, dass sie keine Diebin auf die einfache Art war, wie der Zettel Ihre Freundin glauben machen will. Sie war ein verzweifeltes Mädchen, zuerst beraubt von reichen Leuten, die es sich locker hätten leisten können, sie zu bezahlen, sich aber dagegen entschieden hatten. Sie hat sich selbst das Einzige zurückgeholt, was sie erreichen konnte, und ein Jahrhundert ehrlicher Gastfreundschaft darauf aufgebaut. Es gibt schlechtere Fundamente für ein Gasthaus.«</w:t>
+        <w:t xml:space="preserve">»Sie hatte noch Geld zu bekommen«, sagte Neil und beobachtete mich beim Lesen. »Das ist der Teil, den der Klatsch immer weglässt, weil Klatsch einen sauberen kleinen Bösewicht und ein sauberes kleines Verbrechen will. Die Blackburns hatten ihre Hausangestellten seit Monaten nicht bezahlt, in dem Winter von vierundzwanzig. Ich habe die Beschwerden da drin, die anderen Bediensteten, die hingeworfen haben, und einen Brief, Mrs. Claus, einen Brief von Constance höchstpersönlich, in dem sie ganz höflich um ihren ausstehenden Lohn bittet und als Antwort zu hören bekommt, sie solle dankbar sein, dass sie ein Dach über dem Kopf hat. Ihre Mutter lag im selben Winter drei Straßen weiter im Sterben, und es war kein Geld für einen Arzt da, absolut keines. Und sie stand da, Tag für Tag, und entstaubte eine Brosche, die mehr wert war, als sie in drei Leben verdienen würde, während die Familie, der sie gehörte, ihr sagte, sie solle dankbar sein.« Er breitete die Hände aus. »Ich sage nicht, dass es richtig war, sie mitzunehmen. Ich sage nur, dass sie keine Diebin auf die einfache Art war, wie der Zettel Ihre Freundin glauben machen will. Sie war ein verzweifeltes Mädchen, zuerst beraubt von reichen Leuten, die es sich locker hätten leisten können, sie zu bezahlen, sich aber dagegen entschieden hatten. Sie hat sich selbst das Einzige zurückgeholt, was sie erreichen konnte, und ein Jahrhundert ehrlicher Gastfreundschaft darauf aufgebaut. Es gibt schlechtere Fundamente für einen Gasthof.«</w:t>
       </w:r>
     </w:p>
     <w:p>
@@ -3312,7 +3312,7 @@
     </w:p>
     <w:p>
       <w:r>
-        <w:t>Der zweite Zettel kam am nächsten Morgen, dem ersten Tag des Festes, im Gasthof an, und Fiona rief mich mit einer Stimme an, der jeglicher Halt abhanden gekommen war.</w:t>
+        <w:t xml:space="preserve">Der zweite Zettel kam am nächsten Morgen, dem ersten Tag des Festes, im Gasthof an, und Fiona rief mich mit einer Stimme an, der jeglicher Halt abhandengekommen war.</w:t>
       </w:r>
     </w:p>
     <w:p/>
@@ -3584,7 +3584,7 @@
     </w:p>
     <w:p>
       <w:r>
-        <w:t xml:space="preserve">Der Zettel zitierte Theos Worte. Der Saphir in ihrem Herzen: fünf Wörter, die Diktion eines Historikers und nicht die eines Diebs, die im Erpresserzettel genau so standen wie auf der Karte in Theos sorgfältiger, geneigter Handschrift. Der Zettel war auf dem cremefarbenen Briefpapier des Vereins geschrieben, dem schweren Büttenpapier, das ich gestapelt auf dem Empfangstresen der Ausstellung gesehen hatte. Der Mann, der das Archiv leitete, ging unter. Er hatte an jede ehrliche Tür in drei Bundesstaaten geklopft und zugesehen, wie sie zufielen. Er hatte sich vor die gesamte Stadt gestellt und reumütig verkündet, dass just die Briefe, die die Brosche beschrieben, abhanden gekommen waren.</w:t>
+        <w:t xml:space="preserve">Der Zettel zitierte Theos Worte. Der Saphir in ihrem Herzen: fünf Wörter, die Diktion eines Historikers und nicht die eines Diebs, die im Erpresserzettel genau so standen wie auf der Karte in Theos sorgfältiger, geneigter Handschrift. Der Zettel war auf dem cremefarbenen Briefpapier des Vereins geschrieben, dem schweren Büttenpapier, das ich gestapelt auf dem Empfangstresen der Ausstellung gesehen hatte. Der Mann, der das Archiv leitete, ging unter. Er hatte an jede ehrliche Tür in drei Bundesstaaten geklopft und zugesehen, wie sie zufielen. Er hatte sich vor die gesamte Stadt gestellt und reumütig verkündet, dass just die Briefe, die die Brosche beschrieben, abhandengekommen waren.</w:t>
       </w:r>
     </w:p>
     <w:p>
@@ -3633,7 +3633,7 @@
     </w:p>
     <w:p>
       <w:r>
-        <w:t>Ich saß still im Schein der Lampe. Der Diebstahl der Brosche und der Kauf des Gasthofs waren zwei verschiedene Geheimnisse, aufbewahrt in zwei verschiedenen Gebäuden. Theo hatte eines davon. Er hatte das Archiv, die Briefe, die Karteikarte, das Briefpapier. Er hatte den Diebstahl. Aber der Beweis, dass gestohlenes Geld zu diesem geliebten Gasthof geworden war, befand sich im Rathaus, in den Grundbuchakten, bei denen eine steife, müde Frau mir in die Augen geschaut und geschworen hatte, sie lese darin nie.</w:t>
+        <w:t xml:space="preserve">Ich saß still im Schein der Lampe. Der Diebstahl der Brosche und der Kauf des Gasthofs waren zwei verschiedene Geheimnisse, aufbewahrt in zwei verschiedenen Gebäuden. Theo hatte eines davon. Er hatte das Archiv, die Briefe, die Karteikarte, das Briefpapier. Er wusste vom Diebstahl. Aber der Beweis, dass gestohlenes Geld zu diesem geliebten Gasthof geworden war, befand sich im Rathaus, in den Grundbuchakten, bei denen eine steife, müde Frau mir in die Augen geschaut und geschworen hatte, sie lese darin nie.</w:t>
       </w:r>
     </w:p>
     <w:p>
@@ -3729,7 +3729,7 @@
     <w:p/>
     <w:p>
       <w:r>
-        <w:t>Ihre Augen waren hell geworden, und sie brachte es nicht fertig, meinen Blick zu erwidern, ebensowenig wie jedes Mal, wenn die alte Geschichte laut ausgesprochen wurde. Ich begriff, während ich dort in meinem Mantel mit der Anger-Urkunde in der Tasche stand, dass Vera Reed keine Bösewichtin war. Sie war eine verängstigte Frau, die von einem Mann, dem sie vertraute, oder den sie bemitleidete, oder beidem, in etwas hineingezogen worden war, und sie steckte nun zu tief drin, um wieder herauszukommen. Sie wusste es, und sie schlief keinen Deut besser als die Frau, die zu zerstören sie mithalf.</w:t>
+        <w:t xml:space="preserve">Ihre Augen waren hell geworden, und sie brachte es nicht fertig, meinen Blick zu erwidern, ebenso wenig wie jedes Mal, wenn die alte Geschichte laut ausgesprochen wurde. Ich begriff, während ich dort in meinem Mantel mit der Anger-Urkunde in der Tasche stand, dass Vera Reed keine Bösewichtin war. Sie war eine verängstigte Frau, die von einem Mann, dem sie vertraute, oder den sie bemitleidete, oder beidem, in etwas hineingezogen worden war, und sie steckte nun zu tief drin, um wieder herauszukommen. Sie wusste es, und sie schlief keinen Deut besser als die Frau, die zu zerstören sie mithalf.</w:t>
       </w:r>
     </w:p>
     <w:p/>
@@ -3794,7 +3794,7 @@
     <w:p/>
     <w:p>
       <w:r>
-        <w:t xml:space="preserve">Es lief folgendermaßen ab: Ich wusste, wer. Ich wusste, wie. Ich hatte die Beweise dafür: die Katalogkarte, das abgeglichene Papier an der Lampe, die Eigentumsurkunde des Gasthofs, die offen außerhalb ihrer Schublade lag. Ich konnte also leise zu Theo und Vera gehen, nur wir zu dritt, sonst niemand, und sagen: Ich weiß Bescheid. Hört jetzt auf, und hier und heute endet es, ohne dass es jemand erfährt. Niemals wieder. Und das würden sie, weil sie ängstliche Menschen waren und keine abgebrühten. Sie würden vor Erleichterung weinen, dass man sie davonkommen ließ. Die Zettel würden aufhören, und Fiona wäre in Sicherheit. Das Geheimnis würde zurück in seinen Koffer auf dem Dachboden wandern. Theo würde seinen Verein und seinen guten Ruf behalten und Vera ihren Job. Die Stadt müsste nie erfahren, dass zwei ihrer eigenen Leute für eine einzige harte Jahreszeit auf Abwege geraten waren. Allen, die ich liebte, würde der Kummer darüber erspart bleiben.</w:t>
+        <w:t xml:space="preserve">Es lief folgendermaßen ab: Ich wusste, wer. Ich wusste, wie. Ich hatte die Beweise dafür: die Karteikarte, das abgeglichene Papier an der Lampe, die Urkunde des Gasthofs, die offen außerhalb ihrer Schublade lag. Ich konnte also leise zu Theo und Vera gehen, nur wir zu dritt, sonst niemand, und sagen: Ich weiß Bescheid. Hört jetzt auf, und hier und heute endet es, ohne dass es jemand erfährt. Niemals wieder. Und das würden sie, weil sie ängstliche Menschen waren und keine abgebrühten. Sie würden vor Erleichterung weinen, dass man sie davonkommen ließ. Die Zettel würden aufhören, und Fiona wäre in Sicherheit. Das Geheimnis würde zurück in seinen Koffer auf dem Dachboden wandern. Theo würde seinen Verein und seinen guten Ruf behalten und Vera ihren Job. Die Stadt müsste nie erfahren, dass zwei ihrer eigenen Leute für eine einzige harte Jahreszeit auf Abwege geraten waren. Allen, die ich liebte, würde der Kummer darüber erspart bleiben.</w:t>
       </w:r>
     </w:p>
     <w:p/>
@@ -3905,7 +3905,7 @@
     </w:p>
     <w:p>
       <w:r>
-        <w:t xml:space="preserve">Polizeichefin Tanaka hörte sich die Sache in ihrem kleinen Büro auf der Wache an; ihr abgenutztes Notizbuch lag aufgeschlagen auf dem Schreibtisch vor ihr und ihr Füller ruhte still darauf. Sie schrieb nicht mit, während sie abwägte, ob sie einem glauben sollte. Ich breitete alles vor ihr aus, so wie ich es mir am Küchentisch zurechtgelegt hatte. Die beiden Zettel. Theos Katalogkarte mit den fünf übereinstimmenden Wörtern. Das Briefpapier des Vereins, Maserung für Maserung unter der Lampe verglichen. Der Grundbucheintrag des Gasthofs, der in Veras Ablagekorb außerhalb seiner Schublade lag. Constance, die Brosche, das Pfandhaus in Ridgeline, die ganze hundertjährige Wurzel der Sache und Neils Mappe darunter, jener Teil, der aus der Wurzel eine menschliche machte.</w:t>
+        <w:t xml:space="preserve">Polizeichefin Tanaka hörte sich die Sache in ihrem kleinen Büro auf der Wache an; ihr abgenutztes Notizbuch lag aufgeschlagen auf dem Schreibtisch vor ihr und ihr Füller ruhte still darauf. Sie schrieb nicht mit, während sie abwägte, ob sie einem glauben sollte. Ich breitete alles vor ihr aus, so wie ich es mir am Küchentisch zurechtgelegt hatte. Die beiden Zettel. Theos Karteikarte mit den fünf übereinstimmenden Wörtern. Das Briefpapier des Vereins, Maserung für Maserung unter der Lampe verglichen. Die Urkunde des Gasthofs, die in Veras Ablagekorb außerhalb ihrer Schublade lag. Constance, die Brosche, das Pfandhaus in Ridgeline, die ganze hundertjährige Wurzel der Sache und Neils Mappe darunter, jener Teil, der aus der Wurzel eine menschliche machte.</w:t>
       </w:r>
     </w:p>
     <w:p>
@@ -4056,7 +4056,7 @@
         <w:t xml:space="preserve">der Saphir in ihrem Herzen</w:t>
       </w:r>
       <w:r>
-        <w:t xml:space="preserve"> bezeichnet. Das sind deine Worte, Theo. Sie stehen auf deiner Katalogkarte, mit deiner eigenen Handschrift, der Karte für die Blackburn-Briefe, von denen du der ganzen Stadt bei der Eröffnung erzählt hast, sie seien verschollen. Die Briefe sind nicht verschollen. Du hast sie an dich genommen, weil sie das Geheimnis enthielten, und hast sie dann als verloren bezeichnet, damit niemand auf die Idee käme zu fragen, was darin stand.« Ich machte eine Pause und ließ den nächsten Teil leise folgen. »Du hast einen Weg gefunden, den Verein mit diesen Briefen zu retten. Und du hast ihn gewählt. Nicht wahr?«</w:t>
+        <w:t xml:space="preserve"> bezeichnet. Das sind deine Worte, Theo. Sie stehen auf deiner Karteikarte, mit deiner eigenen Handschrift, der Karte für die Blackburn-Briefe, von denen du der ganzen Stadt bei der Eröffnung erzählt hast, sie seien verschollen. Die Briefe sind nicht verschollen. Du hast sie an dich genommen, weil sie das Geheimnis enthielten, und hast sie dann als verloren bezeichnet, damit niemand auf die Idee käme zu fragen, was darin stand.« Ich machte eine Pause und ließ den nächsten Teil leise folgen. »Du hast einen Weg gefunden, den Verein mit diesen Briefen zu retten. Und du hast ihn gewählt. Nicht wahr?«</w:t>
       </w:r>
     </w:p>
     <w:p/>
@@ -4145,7 +4145,7 @@
     <w:p/>
     <w:p>
       <w:r>
-        <w:t xml:space="preserve">»Restaurative Gerechtigkeit«, erklärte sie uns allen hinterher mit einfacheren Worten bei Kaffee im Gasthof. »Das funktioniert nur, wenn die Person, die das Unrecht begangen hat, sich dem Schaden stellt und ihn mit eigenen Händen wiedergutmacht. Also werden sie genau das tun. Keine Zelle. Etwas, das auf seine Art härter ist als eine Zelle. Sie werden es wieder gutmachen, vor den Menschen, denen sie wehgetan haben, über einen langen Zeitraum hinweg. Und wenn sie daran scheitern, steht die härtere Tür nach wie vor direkt hinter ihnen.«</w:t>
+        <w:t xml:space="preserve">»Restaurative Gerechtigkeit«, erklärte sie uns allen hinterher mit einfacheren Worten bei Kaffee im Gasthof. »Das funktioniert nur, wenn die Person, die das Unrecht begangen hat, sich dem Schaden stellt und ihn mit eigenen Händen wiedergutmacht. Also werden sie genau das tun. Keine Zelle. Etwas, das auf seine Art härter ist als eine Zelle. Sie werden es wiedergutmachen, vor den Menschen, denen sie wehgetan haben, über einen langen Zeitraum hinweg. Und wenn sie daran scheitern, steht die härtere Tür nach wie vor direkt hinter ihnen.«</w:t>
       </w:r>
     </w:p>
     <w:p/>
@@ -4223,7 +4223,7 @@
     <w:p/>
     <w:p>
       <w:r>
-        <w:t xml:space="preserve">Das hätte das Ende sein müssen. Doch da war nach wie vor die Sache mit dem Verein selbst, genau jenem Ort, den Theo sich ruiniert hatte zu retten. Er war nun weg von dort. Das Dach ließ nach wie vor Regen durch, und die Heizung gab weiterhin den Geist auf, und nichts in der ganzen Abrechnung hatte auch nur einen einzigen Dollar zu dem einen oder dem anderen beigesteuert.</w:t>
+        <w:t xml:space="preserve">Das hätte das Ende sein müssen. Doch da war nach wie vor die Sache mit dem Verein selbst, genau jenem Ort, für dessen Rettung Theo sich selbst ruiniert hatte. Er war nun weg von dort. Das Dach ließ nach wie vor Regen durch, und die Heizung gab weiterhin den Geist auf, und nichts in der ganzen Abrechnung hatte auch nur einen einzigen Dollar zu dem einen oder dem anderen beigesteuert.</w:t>
       </w:r>
     </w:p>
     <w:p/>
@@ -4417,7 +4417,7 @@
     <w:p/>
     <w:p>
       <w:r>
-        <w:t xml:space="preserve">Der Verein brauchte nach Theo dringend etwas Ordnung, weshalb sich der Kreis und gut die Hälfte der Evergreen Avenue in den nächsten Tagen daran machten, das Archiv wieder in Stand zu setzen.</w:t>
+        <w:t xml:space="preserve">Der Verein brauchte nach Theo dringend etwas Ordnung, weshalb sich der Kreis und gut die Hälfte der Evergreen Avenue in den nächsten Tagen daran machten, das Archiv wieder instand zu setzen.</w:t>
       </w:r>
     </w:p>
     <w:p>
@@ -4473,7 +4473,7 @@
     </w:p>
     <w:p>
       <w:r>
-        <w:t xml:space="preserve">»Er hat schließlich die halbe Spur zu ihr gefunden«, fuhr Noriko fort, »selbst wenn er sie auf Umwegen gesucht hat. Er hat dreißig Jahre seines Lebens darauf verwendet zu wissen, wo die vergrabenen Dinge dieser Stadt liegen. Er sollte dabei sein, wenn dieses hier ans Licht kommt. Es ist vielleicht das erste gute Ding, in dessen Nähe er wieder sein darf. Und in der Nähe von etwas Gutem zu stehen, für das er keine Lorbeeren erntet, ist vielleicht genau die Medizin, die er braucht.«</w:t>
+        <w:t xml:space="preserve">»Er hat schließlich die halbe Spur zu ihr gefunden«, fuhr Noriko fort, »selbst wenn er sie auf die falsche Weise gefunden hat. Er hat dreißig Jahre seines Lebens darauf verwendet zu wissen, wo die vergrabenen Dinge dieser Stadt liegen. Er sollte dabei sein, wenn dieses hier ans Licht kommt. Es ist vielleicht das erste gute Ding, in dessen Nähe er wieder sein darf. Und in der Nähe von etwas Gutem zu stehen, für das er keine Lorbeeren erntet, ist vielleicht genau die Medizin, die er braucht.«</w:t>
       </w:r>
     </w:p>
     <w:p>
@@ -4869,7 +4869,7 @@
     <w:p/>
     <w:p>
       <w:r>
-        <w:t>Dot lachte ihr kurzes, trockenes Lachen aus dem Kreis heraus, ohne von ihrem eigenen Kranz aufzusehen, der bereits anderthalbmal so groß wie der von allen anderen und doppelt so dicht war. »Sie ist schon hinter deinem Trick her, seit du reingestürmt bist. In den Achtzigern war sie schon hinter meinem her.« Dot war stämmig und grau und sagte sehr viel mit sehr wenigen Worten. Sie hatte jahrzehntelang Kränze in diesem Laden gebunden. Das sah man ihren Händen an. Sie standen nie still und gerieten nie ins Stocken.</w:t>
+        <w:t xml:space="preserve">Dot lachte ihr kurzes, trockenes Lachen aus dem Kreis heraus, ohne von ihrem eigenen Kranz aufzusehen, der bereits anderthalbmal so groß wie der von allen anderen und doppelt so dicht war. »Sie ist schon hinter deinem Trick her, seit dem Tag, an dem du hereingespaziert bist. In den Achtzigern war sie schon hinter meinem her.« Dot war stämmig und grau und sagte sehr viel mit sehr wenigen Worten. Sie hatte jahrzehntelang Kränze in diesem Laden gebunden. Das sah man ihren Händen an. Sie standen nie still und gerieten nie ins Stocken.</w:t>
       </w:r>
     </w:p>
     <w:p/>
@@ -5007,7 +5007,7 @@
     <w:p/>
     <w:p>
       <w:r>
-        <w:t>»Weiß jemand, was in den alten Fenwick-Laden rein kommt?«, fragte sie, ohne aufzusehen. »Der leerstehende, hinter der Apotheke. Irgendjemand hat die Fenster mit Papier abgeklebt.«</w:t>
+        <w:t xml:space="preserve">»Weiß jemand, was in den alten Fenwick-Laden reinkommt?«, fragte sie, ohne aufzusehen. »Der leerstehende, hinter der Apotheke. Irgendjemand hat die Fenster mit Papier abgeklebt.«</w:t>
       </w:r>
     </w:p>
     <w:p/>
@@ -5121,13 +5121,13 @@
     <w:p/>
     <w:p>
       <w:r>
-        <w:t xml:space="preserve">Und das war die vernünftige Sichtweise, und der Kreis nahm sie an, und irgendjemand sagte, die Jugend von heute, und jemand anderes sagte, so wie früher habe es nie geschneit, als ich ein Mädchen war, und das Gespräch ging weiter, wie Gespräche im Kreis nun mal gehen, und Ivy ging sich ein weiteres Ingwerplätzchen holen. Aber ich blieb einen Moment länger als die anderen am Fenster stehen, mit meinem halbfertigen Kranz in der Hand. Ich blickte auf diesen mittleren Schneemann, der den Block hinaufblickte. Ich blickte auf den glatten, unberührten Schnee, den die Stiefel keines Spaßvogels berührt hatten. Und ich sagte nicht, was ich dachte.</w:t>
-      </w:r>
-    </w:p>
-    <w:p/>
-    <w:p>
-      <w:r>
-        <w:t xml:space="preserve">Denn ich kenne den Unterschied. Ich lebe nun schon sehr lange an der Seite der Magie von Weihnachten. Lange genug, um sie in meinen Knochen zu spüren, so schlicht wie einen Fußstapfen auf meiner eigenen Treppe. Das war kein Kind mit kalten Fingern. Die Magie lief frei in Frost Falls herum. Sie war frei, seit wir angekommen waren, und suchte nach einem Zuhause. Mein Mann baute ihr eines. Langsam und geduldig in seiner Werkstatt, eine Herdstelle, in der sie sich niederlassen konnte, und sie zog dem Feuer jeden Tag ein wenig näher. Aber sie war noch nicht zur Ruhe gekommen. Sie war nachts immer noch draußen im Städtchen, warm und tollpatschig und völlig frei von Bosheit, und tat die kleinen, unmöglichen Dinge, die die Magie eben tut, wenn sie mehr Gefühl als Verstand hat. Sie verwandelte die Festtagsbeleuchtung von orange in gold. Und jetzt, wie es aussah, ließ sie im Dunkeln den Schneemann eines Kindes so herumgehen, dass er auf das blickte, was ihre wandernde Aufmerksamkeit erregt hatte.</w:t>
+        <w:t xml:space="preserve">Und das war die vernünftige Sichtweise, und der Kreis nahm sie an, und irgendjemand sagte, die Jugend von heute, und eine andere sagte, so habe es nie geschneit, als sie ein Mädchen gewesen sei, und das Gespräch ging weiter, wie Gespräche im Kreis nun mal gehen, und Ivy ging sich ein weiteres Ingwerplätzchen holen. Aber ich blieb einen Moment länger als die anderen am Fenster stehen, mit meinem halbfertigen Kranz in der Hand. Ich blickte auf diesen mittleren Schneemann, der den Block hinaufblickte. Ich blickte auf den glatten, unberührten Schnee, den die Stiefel keines Spaßvogels berührt hatten. Und ich sagte nicht, was ich dachte.</w:t>
+      </w:r>
+    </w:p>
+    <w:p/>
+    <w:p>
+      <w:r>
+        <w:t xml:space="preserve">Denn ich kenne den Unterschied. Ich lebe nun schon sehr lange an der Seite der Magie von Weihnachten. Lange genug, um sie in meinen Knochen zu spüren, so schlicht wie einen Fußstapfen auf meiner eigenen Treppe. Das war kein Kind mit kalten Fingern. Die Magie lief frei in Frost Falls herum. Sie war frei, seit wir angekommen waren, und suchte nach einem Zuhause. Mein Mann baute ihr eines. Langsam und geduldig in seiner Werkstatt, eine Herdstelle, in der sie sich niederlassen konnte, und sie zog dem Feuer jeden Tag ein wenig näher. Aber sie war noch nicht zur Ruhe gekommen. Sie war nachts immer noch draußen im Städtchen, warm und tollpatschig und völlig frei von Bosheit, und tat die kleinen, unmöglichen Dinge, die die Magie eben tut, wenn sie mehr Gefühl als Verstand hat. Sie verwandelte die Festtagsbeleuchtung von Orange in Gold. Und jetzt, wie es aussah, ließ sie im Dunkeln den Schneemann eines Kindes so herumgehen, dass er auf das blickte, was ihre wandernde Aufmerksamkeit erregt hatte.</w:t>
       </w:r>
     </w:p>
     <w:p/>

</xml_diff>

<commit_message>
Full proofcheck Inn Trouble German: SIGNIFICANT (109 edits)
Co-Authored-By: Claude Opus 5.5 <noreply@anthropic.com>
Claude-Session: https://claude.ai/code/session_012Cm8JxdqzjuttdUSdkQCUg
</commit_message>
<xml_diff>
--- a/translated/corrected/Inn Trouble - ASSEMBLED - FORMATTED_German.docx
+++ b/translated/corrected/Inn Trouble - ASSEMBLED - FORMATTED_German.docx
@@ -235,7 +235,7 @@
     </w:p>
     <w:p>
       <w:r>
-        <w:t>Die Lobby war erfüllt von der wohltuenden, tiefen Wärme eines Feuers, das schon seit vor Anbruch des Morgens brannte. Es roch nach Kaffee und Holzrauch, die sich über den älteren Geruch des Hauses selbst legten, nach Bienenwachs und altem Holz. Gäste saßen in den niedrigen Sesseln verstreut, ein Paar am Fenster mit einer ausgebreiteten Landkarte dazwischen, eine ältere Dame am Kamin mit einem Taschenbuch, und der Raum hatte das unbeschwerte Gemurmel eines Ortes, an dem sich die Menschen behaglich fühlen. An diesem Morgen lag jedoch ein neuer Geruch über alledem, scharf und ein wenig metallisch, den ich zunächst nicht einzuordnen wusste. Als ich mich umsah, verstand ich. Sam Patels Schmiedearbeiten waren überall, wohin ich blickte. Er hatte die Lampenhalterungen an den Wänden gefertigt, das hohe Funkenschutzgitter am Kamin und eine Reihe schwarzer eiserner Sterne auf dem Kaminsims für das Fest, und der gesamte vordere Raum hatte den schwachen, reinen Hauch der Esse angenommen, der sich so in der Luft verströmt wie der Geruch von Brot in einer Küche.</w:t>
+        <w:t xml:space="preserve">Die Lobby war erfüllt von der wohltuenden, tiefen Wärme eines Feuers, das schon seit vor Anbruch des Morgens brannte. Es roch nach Kaffee und Holzrauch, die sich über den älteren Geruch des Hauses selbst legten, nach Bienenwachs und altem Holz. Gäste saßen in den niedrigen Sesseln verstreut, ein Paar am Fenster mit einer ausgebreiteten Landkarte dazwischen, eine ältere Dame am Kamin mit einem Taschenbuch, und der Raum hatte das unbeschwerte Gemurmel eines Ortes, an dem sich die Menschen behaglich fühlen. An diesem Morgen lag jedoch ein neuer Geruch über alledem, scharf und ein wenig metallisch, den ich zunächst nicht einzuordnen wusste. Als ich mich umsah, verstand ich. Sam Patels Schmiedearbeiten waren überall, wohin ich blickte. Er hatte die Lampenhalterungen an den Wänden gefertigt, den hohen Funkenschirm am Kamin und eine Reihe schwarzer eiserner Sterne auf dem Kaminsims für das Fest, und der gesamte vordere Raum hatte den schwachen, reinen Hauch der Esse angenommen, der sich so in der Luft verströmt wie der Geruch von Brot in einer Küche.</w:t>
       </w:r>
     </w:p>
     <w:p>
@@ -340,7 +340,7 @@
     </w:p>
     <w:p>
       <w:r>
-        <w:t>Zwanzig Dollar. Ich wälzte diese Summe im Kopf hin und her wie einen Stein, den man im Schuh hat. Es war eine so geringe Summe, um eine solch gewaltige Anspannung in die Stimmen zweier anständiger Menschen zu bringen. Sam war kein Mann, der eine Freundin wegen zwanzig Dollar hetzen würde. Fiona war keine Frau, die eine Rechnung drei Wochen lang schleppen ließ. Etwas unterhalb ihrer beiden Oberflächen hatte sich gelöst.</w:t>
+        <w:t xml:space="preserve">Zwanzig Dollar. Ich wälzte diese Summe im Kopf hin und her wie einen Stein, den man im Schuh hat. Es war eine so geringe Summe, um eine solch gewaltige Anspannung in die Stimmen zweier anständiger Menschen zu bringen. Sam war kein Mann, der eine Freundin wegen zwanzig Dollar hetzen würde. Fiona war keine Frau, die eine Rechnung drei Wochen lang schleifen ließ. Etwas unterhalb ihrer beiden Oberflächen hatte sich gelöst.</w:t>
       </w:r>
     </w:p>
     <w:p>
@@ -370,7 +370,7 @@
     </w:p>
     <w:p>
       <w:r>
-        <w:t>»Claus.« Er lächelte, und es war ein gutes Lächeln, unverkrampft und eingeübt, aber ich vertraute ihm ungefähr so weit, wie ich das Funkenschutzgitter hätte werfen können. »Dann sind Sie also die berühmte Mrs. Claus. Wie absolut wunderbar. Man hat es natürlich gehört, man hört so einiges, aber ich habe es erst jetzt so recht geglaubt.« Er beugte sich ein Stück vor, ganz vertraulich. »Sagen Sie mir. Sind die Sachen der alten Familien hier, der Blackburns und der anderen, noch im Ort zu finden? Erbstücke, Möbel, Schmuck, solche Dinge? Ich bin da zufällig einem Stück auf der Spur. Einer Brosche.«</w:t>
+        <w:t xml:space="preserve">»Claus.« Er lächelte, und es war ein gutes Lächeln, unverkrampft und eingeübt, aber ich vertraute ihm ungefähr so weit, wie ich den Funkenschirm hätte werfen können. »Dann sind Sie also die berühmte Mrs. Claus. Wie absolut wunderbar. Man hat es natürlich gehört, man hört so einiges, aber ich habe es erst jetzt so recht geglaubt.« Er beugte sich ein Stück vor, ganz vertraulich. »Sagen Sie mir. Sind die Sachen der alten Familien hier, der Blackburns und der anderen, noch im Ort zu finden? Erbstücke, Möbel, Schmuck, solche Dinge? Ich bin da zufällig einem Stück auf der Spur. Einer Brosche.«</w:t>
       </w:r>
     </w:p>
     <w:p>
@@ -475,7 +475,7 @@
     </w:p>
     <w:p>
       <w:r>
-        <w:t>Sie piepste, vollkommen ungerührt. Wir gingen durch den goldkalten Vormittag nach Hause, und ich drehte mich nicht um, um noch einmal zu den Dachrinnen des Gasthofs hinaufzusehen, auch wenn ein Teil von mir wissen wollte, ob die Lichter dort immer noch orange leuchteten oder still und leise wieder gold geworden waren, während ich ihnen den Rücken zukehrte.</w:t>
+        <w:t xml:space="preserve">Sie piepste, vollkommen ungerührt. Wir gingen durch den goldkalten Vormittag nach Hause, und ich drehte mich nicht um, um noch einmal zur Dachtraufe des Gasthofs hinaufzusehen, auch wenn ein Teil von mir wissen wollte, ob die Lichter dort immer noch orange leuchteten oder still und leise wieder gold geworden waren, während ich ihnen den Rücken zukehrte.</w:t>
       </w:r>
     </w:p>
     <w:p>
@@ -570,7 +570,7 @@
     </w:p>
     <w:p>
       <w:r>
-        <w:t xml:space="preserve">Es war ein Zettel. Die Handschrift war absichtlich schlecht, lauter ungleichmäßige Schrägstriche und gebrochene Buchstaben, die sorgfältige Ungeschicklichkeit, die ein Mensch an den Tag legt, der sich große Mühe gibt, seine Handschrift zu verstellen. Die Summe war das Erste, was ich sah, denn wer immer sie geschrieben hatte, wollte, dass die Summe das Erste war, was irgendjemand sah. Fünfhunderttausend Dollar. Und darunter, in demselben mühseligen Krakel, der Rest. </w:t>
+        <w:t xml:space="preserve">Es war ein Zettel. Die Handschrift war absichtlich schlecht, lauter ungleichmäßige Schrägstriche und gebrochene Buchstaben, die sorgfältige Ungeschicklichkeit, die ein Mensch an den Tag legt, der sich große Mühe gibt, seine Handschrift zu verstellen. Die Summe war das Erste, was ich sah, denn wer immer ihn geschrieben hatte, wollte, dass die Summe das Erste war, was irgendjemand sah. Fünfhunderttausend Dollar. Und darunter, in demselben mühseligen Krakel, der Rest. </w:t>
       </w:r>
       <w:r>
         <w:rPr>
@@ -745,7 +745,7 @@
     </w:p>
     <w:p>
       <w:r>
-        <w:t>Was den anderen übrig ließ.</w:t>
+        <w:t xml:space="preserve">Blieb also der andere.</w:t>
       </w:r>
     </w:p>
     <w:p>
@@ -796,7 +796,7 @@
     <w:p/>
     <w:p>
       <w:r>
-        <w:t>»Die Frage ist also nicht, wer Fiona hasst«, sagte er. »Weil niemand Fiona hasst. Du würdest in dieser Stadt keine Seele finden, die ein schlechtes Wort über sie verliert, selbst wenn man eine Belohnung aussetzt. Die Frage ist, wer die Blackburn-Akten gelesen hat.«</w:t>
+        <w:t xml:space="preserve">»Die Frage ist also nicht, wer Fiona hasst«, sagte er. »Weil niemand Fiona hasst. Du würdest in dieser Stadt keine Seele finden, die ein schlechtes Wort über sie verliert, selbst wenn man eine Belohnung aussetzt. Die Frage ist, wer die Blackburn-Papiere gelesen hat.«</w:t>
       </w:r>
     </w:p>
     <w:p/>
@@ -904,7 +904,7 @@
     <w:p/>
     <w:p>
       <w:r>
-        <w:t>»Das trifft auf eine ganze Menge Dinge zu«, sagte ich, »und es war in der gesamten Geschichte der Menschheit noch nie auf ein Vogelhäuschen zutreffend, was du mir in der Woche unseres Einzugs erzählt hast.«</w:t>
+        <w:t xml:space="preserve">»Das trifft auf eine ganze Menge Dinge zu«, sagte ich, »und es hat in der gesamten Geschichte der Welt noch nie auf ein Vogelhäuschen zugetroffen – und ein Vogelhäuschen sollte es ja sein, wie du mir in der Woche unseres Einzugs erzählt hast.«</w:t>
       </w:r>
     </w:p>
     <w:p/>
@@ -1071,12 +1071,12 @@
     </w:p>
     <w:p>
       <w:r>
-        <w:t>Pip watschelte hinter unseren Knien vorbei, und die Leute in unmittelbarer Nähe machten jenes sanfte, erfreute Geräusch, das sie bei Pip immer von sich gaben, ein Raunen von Oh schau mal und ist das etwa ein Pinguin. Ich ließ sie laufen, damit sie bewundert werden konnte. Da alle Augen auf den Pinguin gerichtet waren, achtete niemand auf mich.</w:t>
-      </w:r>
-    </w:p>
-    <w:p>
-      <w:r>
-        <w:t>Und es gab wahrlich genug zu sehen, denn sie waren alle da. Jedes einzelne von ihnen, stellte ich fest, befand sich im selben Gebäude, in dem die Blackburn-Kisten in greifbarer Nähe standen, an demselben hellen Morgen.</w:t>
+        <w:t xml:space="preserve">Pip watschelte an unseren Knien vorbei, und die Leute in unmittelbarer Nähe machten jenes sanfte, erfreute Geräusch, das sie bei Pip immer von sich gaben, ein Raunen von Oh schau mal und ist das etwa ein Pinguin. Ich ließ sie laufen, damit sie bewundert werden konnte. Da alle Augen auf den Pinguin gerichtet waren, achtete niemand auf mich.</w:t>
+      </w:r>
+    </w:p>
+    <w:p>
+      <w:r>
+        <w:t xml:space="preserve">Und es gab wahrlich genug zu sehen, denn sie waren alle da. Jeder Einzelne von ihnen, stellte ich fest, befand sich im selben Gebäude, in dem die Blackburn-Kisten in greifbarer Nähe standen, an demselben hellen Morgen.</w:t>
       </w:r>
     </w:p>
     <w:p>
@@ -1086,7 +1086,7 @@
     </w:p>
     <w:p>
       <w:r>
-        <w:t>Vera Reed stand am Empfang, stellte einen flachen Archivkarton mit Papierkram ab, geschäftig und bis zum Hals geknöpft, ihre Bewegungen schnell und zielgerichtet. Sie sagte etwas zu Theo auf der anderen Seite des Raums, und er hob eine Hand als kleine Dankesgeste. Sie nickte einmal zurück und bückte sich, um die Kante des Kartons exakt an der Kante des Tisches auszurichten, unfähig, wie manche Menschen, etwas schief stehen zu lassen.</w:t>
+        <w:t xml:space="preserve">Vera Reed stand am Empfang, stellte einen flachen Archivkarton mit Papieren ab, geschäftig und bis zum Hals geknöpft, ihre Bewegungen schnell und zielgerichtet. Sie sagte etwas zu Theo auf der anderen Seite des Raums, und er hob eine Hand als kleine Dankesgeste. Sie nickte einmal zurück und bückte sich, um die Kante des Kartons exakt an der Kante des Tisches auszurichten, unfähig, wie manche Menschen, etwas schief stehen zu lassen.</w:t>
       </w:r>
     </w:p>
     <w:p>
@@ -1096,7 +1096,7 @@
     </w:p>
     <w:p>
       <w:r>
-        <w:t xml:space="preserve">Ich driftete zu Neil hinüber, denn Neil hatte sich genau zu dem begeben, was ich sehen wollte. Die Ausstellung war eine lange Vitrine, in deren Innerem ein halbes Dutzend alter Briefe aufgefächert lag; die Tinte war braun geworden, das Papier an den Rändern stockfleckig, und dazu gab es ein Kärtchen von Theos Hand mit der Aufschrift: </w:t>
+        <w:t xml:space="preserve">Ich schlenderte zu Neil hinüber, denn Neil hatte sich genau zu dem begeben, was ich sehen wollte. Die Ausstellung war eine lange Vitrine, in deren Innerem ein halbes Dutzend alter Briefe aufgefächert lag; die Tinte war braun geworden, das Papier an den Rändern stockfleckig, und dazu gab es ein Kärtchen von Theos Hand mit der Aufschrift: </w:t>
       </w:r>
       <w:r>
         <w:rPr>
@@ -1182,7 +1182,7 @@
     </w:p>
     <w:p>
       <w:r>
-        <w:t>»Wo hast du das denn her?«, sagte ich und ging in die Knie, um es ihr abzunehmen, doch sie tanzte knapp außerhalb meiner Reichweite herum, stolz wie eine Herzogin bei ihrer Krönung. Rotes Band. Von all den Bändern in einem Gebäude, das mit Gold und Orange geschmückt war, hatte sie sich ausgerechnet den einzigen roten Kringel ausgesucht. Schließlich nahm ich es ihr sanft ab und hielt es in der Hand, eine kleine, helle Spirale aus rotem Satin – genau jenes Rot, das der Erpresser Fiona aufgetragen hatte an ihren Kranz zu hängen, damit er wusste, dass das Geld unter den Stufen wartete.</w:t>
+        <w:t xml:space="preserve">»Wo hast du das denn her?«, sagte ich und ging in die Knie, um es ihr abzunehmen, doch sie tanzte knapp außerhalb meiner Reichweite herum, stolz wie eine Herzogin bei ihrer Krönung. Rotes Band. Von all den Bändern in einem Gebäude, das mit Gold und Orange geschmückt war, hatte sie sich ausgerechnet den einzigen roten Kringel ausgesucht. Schließlich nahm ich es ihr sanft ab und hielt es in der Hand, eine kleine, helle Spirale aus rotem Satin – genau jenes Rot, das der Zettel Fiona an ihren Kranz zu hängen befohlen hatte, damit der Erpresser wüsste, dass das Geld unter den Stufen wartete.</w:t>
       </w:r>
     </w:p>
     <w:p>
@@ -1267,7 +1267,7 @@
     </w:p>
     <w:p>
       <w:r>
-        <w:t>Ich nahm meine Strickarbeit auf und ließ die Wärme und das Klappern der Nadeln über mich hinweggleiten. Nach einer Weile schweifte das Gespräch, wie ich es gehofft hatte, zu Theo ab.</w:t>
+        <w:t xml:space="preserve">Ich nahm meine Strickarbeit auf und ließ mich von der Wärme und dem Klappern der Nadeln einhüllen. Nach einer Weile schweifte das Gespräch, wie ich es gehofft hatte, zu Theo ab.</w:t>
       </w:r>
     </w:p>
     <w:p>
@@ -1317,12 +1317,12 @@
     </w:p>
     <w:p>
       <w:r>
-        <w:t xml:space="preserve">Zu wissen, dass das Geheimnis aus den Papieren stammt, zeigt einem, wo man stehen muss, hatte Nick gesagt. Nicht wer. Theo tat sehr vielen Leuten in Frost Falls leid. Die halbe Stadt hätte geweint, wenn sie erfahren hätte, wie schlimm es um ihn stand. Mitleid mit einem Mann zu haben, selbst wenn man der verzweifeltste Mann der Stadt ist, ist eben nicht dasselbe wie einen Freund um Geld zu erpressen, und ich war nicht bereit, das eine in meinem Kopf mit dem anderen verschwimmen zu lassen, ohne mehr in der Hand zu haben als Rechenexempel und ein schlechtes Gefühl. Also strickte ich weiter, ließ die Faust offen und trug den Verdacht leicht, wie eine glühende Kohle, bereit, sie fallen zu lassen.</w:t>
-      </w:r>
-    </w:p>
-    <w:p>
-      <w:r>
-        <w:t xml:space="preserve">»Sie halten eine Sitzung ab«, sagte Claire. »Der Vorstand. Am Montag. Um zu entscheiden, ob sie die Türen über Neujahr hinaus überhaupt noch offen halten können. Theo hat die Gazette gebeten, jemanden zu schicken. Ich glaube, er hofft, dass eine traurige Geschichte genügt, um irgendwo ein paar Gelder locker zu machen.«</w:t>
+        <w:t xml:space="preserve">Zu wissen, dass das Geheimnis aus den Papieren stammt, zeigt einem, wo man stehen muss, hatte Nick gesagt. Nicht wer. Theo tat sehr vielen Leuten in Frost Falls leid. Die halbe Stadt hätte geweint, wenn sie erfahren hätte, wie schlimm es um ihn stand. Dass einem ein Mann leidtut, ja selbst dass er der verzweifeltste Mann der Stadt ist, ist eben nicht dasselbe, wie eine Freundin um Geld zu erpressen, und ich war nicht bereit, das eine in meinem Kopf mit dem anderen verschwimmen zu lassen, ohne mehr in der Hand zu haben als Rechenexempel und ein schlechtes Gefühl. Also strickte ich weiter, ließ die Faust offen und trug den Verdacht leicht, wie eine glühende Kohle, bereit, sie fallen zu lassen.</w:t>
+      </w:r>
+    </w:p>
+    <w:p>
+      <w:r>
+        <w:t xml:space="preserve">»Sie halten eine Sitzung ab«, sagte Claire. »Der Vorstand. Am Montag. Um zu entscheiden, ob sie die Türen über Neujahr hinaus überhaupt noch offen halten können. Theo hat die Gazette gebeten, jemanden zu schicken. Ich glaube, er hofft, dass eine traurige Geschichte genügt, um irgendwo ein paar Gelder lockerzumachen.«</w:t>
       </w:r>
     </w:p>
     <w:p>
@@ -1362,7 +1362,7 @@
     </w:p>
     <w:p>
       <w:r>
-        <w:t>Das traf mich mitten in die Magengrube. Da war Martha Green, die einen Ehemann begraben und der halben Stadt Frost Falls das Lesen beigebracht hatte, und sie sagte mir, ich gehörte genug dazu, um mich anlehnen zu dürfen.</w:t>
+        <w:t xml:space="preserve">Das schnürte mir die Kehle zu. Da war Martha Green, die einen Ehemann begraben und der halben Stadt Frost Falls das Lesen beigebracht hatte, und sie sagte mir, ich gehörte genug dazu, um mich anlehnen zu dürfen.</w:t>
       </w:r>
     </w:p>
     <w:p>
@@ -1437,7 +1437,7 @@
     </w:p>
     <w:p>
       <w:r>
-        <w:t>Der Hund war heute tatsächlich auch hier. Snowball saß in einer viel zu großen Wollmütze mit Geweih an Emmas Füßen und musterte Pip über die Länge seiner Schnauze hinweg mit tiefem Misstrauen.</w:t>
+        <w:t xml:space="preserve">Der Hund war heute tatsächlich auch hier. Snowball saß in einer etwas zu großen Wollmütze mit Geweih an Emmas Füßen und musterte Pip über die Länge seiner Schnauze hinweg mit tiefem Misstrauen.</w:t>
       </w:r>
     </w:p>
     <w:p>
@@ -1492,7 +1492,7 @@
     </w:p>
     <w:p>
       <w:r>
-        <w:t>Ich wusste genau, was er meinte. Schließlich hatte ich eine ganze Menge Briefe von Menschen gelesen, die tief im Schlamassel steckten. »Dafür ist eine Stadt schließlich da, Mark«, sagte ich. »Du wirst dasselbe für den Nächsten tun.«</w:t>
+        <w:t xml:space="preserve">Ich wusste genau, was er meinte. Schließlich hatte ich eine ganze Menge Briefe von Menschen gelesen, die gerade das Schlimmste durchmachten. »Dafür ist eine Stadt schließlich da, Mark«, sagte ich. »Du wirst dasselbe für den Nächsten tun.«</w:t>
       </w:r>
     </w:p>
     <w:p>
@@ -1587,7 +1587,7 @@
     </w:p>
     <w:p>
       <w:r>
-        <w:t xml:space="preserve">»Morgen um dieselbe Zeit«, sagte ich. »Wegen Pip. Achte nur darauf, dass sie nicht den Rest des Fests auseinanderbricht.«</w:t>
+        <w:t xml:space="preserve">»Morgen um dieselbe Zeit«, sagte ich. »Wegen Pip. Achte nur darauf, dass sie nicht den Rest des Fests auseinandernimmt.«</w:t>
       </w:r>
     </w:p>
     <w:p>
@@ -1603,7 +1603,7 @@
     <w:p/>
     <w:p>
       <w:r>
-        <w:t>Ich ging zwei Tage später wieder in den Gasthof, nicht um Nachforschungen anzustellen, sondern weil Fiona in diesem Augenblick eher eine Freundin als eine Detektivin brauchte, und ich so sehr damit beschäftigt gewesen war, das Erste zu sein, dass ich fast vergessen hatte, das Zweite zu sein.</w:t>
+        <w:t xml:space="preserve">Ich ging zwei Tage später wieder in den Gasthof, nicht um Nachforschungen anzustellen, sondern weil Fiona in diesem Augenblick eher eine Freundin als eine Detektivin brauchte, und ich so sehr damit beschäftigt gewesen war, die Detektivin zu sein, dass ich fast vergessen hatte, die Freundin zu sein.</w:t>
       </w:r>
     </w:p>
     <w:p>
@@ -1768,17 +1768,17 @@
     </w:p>
     <w:p>
       <w:r>
-        <w:t>»Es muss schwer sein«, sagte ich, »wenn man Geld zu bekommen hat, wo das Fest ohnehin so viel kostet. Alle scheinen in diesem Jahr finanziell am Ende zu sein.«</w:t>
-      </w:r>
-    </w:p>
-    <w:p>
-      <w:r>
-        <w:t xml:space="preserve">»Alle sind jedes Jahr am Ende.« Er legte schließlich den Lappen aus der Hand und sah mir direkt in die Augen. »Es macht mir nichts aus, wenn mir eine Freundin, die zu kämpfen hat, Geld schuldet, Mrs. Claus. Die ganze Stadt jongliert, das weiß ich so gut wie jeder andere, ich mache die Hälfte meiner Arbeit auf Vertrauen. Hätte sie einfach gesagt: Sam, es ist knapp, gib mir Zeit bis zum Frühling, hätte ich die Rechnung zerrissen und ihr gesagt, sie solle nicht mehr daran denken. Es ist dieses Nicht-Ansehen-Können, das ich nicht ertragen kann. Eine Frau, der es einfach an Bargeld mangelt, verhält sich nicht so. Sie schämt sich oder hat vor irgendetwas Angst, und das hat nichts mit meinen zwanzig Dollar zu tun, und ich komme nicht nah genug heran, um ihr zu helfen.« Er breitete seine rußgeschwärzten Hände aus. »Ist sie in Schwierigkeiten? Echten Schwierigkeiten? Denn wenn das so ist, würde ich es viel lieber wissen und helfen, als hier draußen zu stehen und wegen Kleinigkeiten beleidigt zu sein wie ein kleinlicher Mensch.«</w:t>
-      </w:r>
-    </w:p>
-    <w:p>
-      <w:r>
-        <w:t>Und das zerstörte mehr als alles andere den letzten Rest meines Argwohns, nah genug jedenfalls, denn ein Mann, der eine Erpressung betrieb, würde nicht in seiner eigenen Schmiede stehen und sein Herz offen zur Schau tragen, um zu fragen, ob es der Frau, die er ausnahm, gut ging. Aber nah genug ist eben nicht dasselbe wie Gewissheit, und ich behielt meine Haltung bei und fragte das Ding, weswegen ich halb unter dem Vorwand des Geruchs gekommen war.</w:t>
+        <w:t xml:space="preserve">»Es muss schwer sein«, sagte ich, »wenn man Geld zu bekommen hat, wo das Fest ohnehin so viel kostet. Alle scheinen in diesem Jahr knapp bei Kasse zu sein.«</w:t>
+      </w:r>
+    </w:p>
+    <w:p>
+      <w:r>
+        <w:t xml:space="preserve">»Knapp bei Kasse sind alle jedes Jahr.« Er legte schließlich den Lappen aus der Hand und sah mir direkt in die Augen. »Es macht mir nichts aus, wenn mir eine Freundin, die zu kämpfen hat, Geld schuldet, Mrs. Claus. Die ganze Stadt jongliert, das weiß ich so gut wie jeder andere, ich mache die Hälfte meiner Arbeit auf Vertrauen. Hätte sie einfach gesagt: Sam, es ist knapp, gib mir Zeit bis zum Frühling, hätte ich die Rechnung zerrissen und ihr gesagt, sie solle nicht mehr daran denken. Es ist dieses Nicht-Ansehen-Können, das ich nicht ertragen kann. Eine Frau, der es einfach an Bargeld mangelt, verhält sich nicht so. Sie schämt sich oder hat vor irgendetwas Angst, und das hat nichts mit meinen zwanzig Dollar zu tun, und ich komme nicht nah genug heran, um ihr zu helfen.« Er breitete seine rußgeschwärzten Hände aus. »Ist sie in Schwierigkeiten? Echten Schwierigkeiten? Denn wenn das so ist, würde ich es viel lieber wissen und helfen, als hier draußen zu stehen und wegen Kleinigkeiten beleidigt zu sein wie ein kleinlicher Mensch.«</w:t>
+      </w:r>
+    </w:p>
+    <w:p>
+      <w:r>
+        <w:t xml:space="preserve">Und das zerstörte mehr als alles andere den letzten Rest meines Argwohns, nah genug jedenfalls, denn ein Mann, der eine Erpressung betrieb, würde nicht in seiner eigenen Schmiede stehen und sein Herz offen zur Schau tragen, um zu fragen, ob es der Frau, die er ausnahm, gut ging. Aber nah genug ist eben nicht dasselbe wie Gewissheit, und ich behielt meine Haltung bei und stellte die Frage, die neben dem Geruch der andere halbe Grund meines Besuchs gewesen war.</w:t>
       </w:r>
     </w:p>
     <w:p>
@@ -1808,7 +1808,7 @@
     </w:p>
     <w:p>
       <w:r>
-        <w:t>In meinem Inneren wurde ich ganz still. Die gesamte Lobby war von seinem Eisen und dem Hauch seines Feuers durchdrungen, so dicht wie der Geruch von hundert Abendessen in einer Küche. Alles, was in dieser Lobby zurückgelassen, alles, was auf dem Empfangstisch abgestellt, unter eine Tür geschoben oder in einer Tasche über diesen Boden getragen wurde, musste den Geruch von Sam Patels Schmiede an sich nehmen.</w:t>
+        <w:t xml:space="preserve">In meinem Inneren wurde ich ganz still. Die gesamte Lobby war von seinem Eisen und dem Hauch seines Feuers durchdrungen, so dicht wie der Geruch von hundert Abendessen in einer Küche. Alles, was in dieser Lobby zurückgelassen, alles, was auf dem Empfangstisch abgestellt, unter eine Tür geschoben oder in einer Tasche über diesen Boden getragen wurde, musste den Geruch von Sam Patels Schmiede annehmen.</w:t>
       </w:r>
     </w:p>
     <w:p>
@@ -1957,7 +1957,7 @@
     <w:p/>
     <w:p>
       <w:r>
-        <w:t>»Ich weiß eine Menge, das Sie nicht wissen«, erwiderte ich freundlich, »über das Stricken und über die Ernährungs- und Lebensgewohnheiten von Pinguinen. Bei Broschen bin ich Ihnen, fürchte ich, keine große Hilfe.«</w:t>
+        <w:t xml:space="preserve">»Ich weiß eine Menge, das Sie nicht wissen«, erwiderte ich freundlich, »über das Stricken und über die Fressgewohnheiten von Pinguinen. Bei Broschen bin ich Ihnen, fürchte ich, keine große Hilfe.«</w:t>
       </w:r>
     </w:p>
     <w:p/>
@@ -1991,7 +1991,7 @@
     </w:p>
     <w:p>
       <w:r>
-        <w:t xml:space="preserve">»Mrs. Claus!« Bram kam im Trab um die Ecke des Häuschens und rang die Mütze zwischen den Händen. Bram war der Elf, der mit uns nach Süden gekommen war, der Vorarbeiter der umgezogenen Werkstatt, treu, pingelig und von der Statur her im Groben wie eine besorgte Kartoffel geformt, und er war nun in heller Aufregung. »Es ist Dancer. Sie hat sich schon wieder losgemacht. Zum dritten Mal diese Woche, Mrs. Claus, zum dritten. Und ich schwöre bei jedem einzelnen Knopf an meiner Weste, dass der Riegel vorgeschoben war, als ich ihn verlassen habe, vorgeschoben und geprüft, und jetzt steht sie hier und frisst den guten Kohl und lässt sich nicht führen, und mir gefällt das ganz und gar nicht, das muss ich dir sagen.«</w:t>
+        <w:t xml:space="preserve">»Mrs. Claus!« Bram kam im Trab um die Ecke des Häuschens und rang die Mütze zwischen den Händen. Bram war der Elf, der mit uns nach Süden gekommen war, der Vorarbeiter der umgezogenen Werkstatt, treu, pingelig und von der Statur her im Groben wie eine besorgte Kartoffel geformt, und er war nun in heller Aufregung. »Es ist Dancer. Sie hat sich schon wieder losgemacht. Zum dritten Mal diese Woche, Mrs. Claus, zum dritten. Und ich schwöre bei jedem einzelnen Knopf, den ich besitze, dass der Riegel vorgeschoben war, als ich ihn verlassen habe, vorgeschoben und geprüft, und jetzt steht sie hier und frisst den guten Kohl und lässt sich nicht führen, und mir gefällt das ganz und gar nicht, das muss ich dir sagen.«</w:t>
       </w:r>
     </w:p>
     <w:p>
@@ -2026,7 +2026,7 @@
     </w:p>
     <w:p>
       <w:r>
-        <w:t>»Ich werde auch draußen gehalten, falls dir das ein Trost ist«, sagte ich ihm, und das schien ihn tatsächlich zu trösten, dieser kleine, arme Trost, Gesellschaft in seinem Groll zu haben. Ich ließ ihn produktiv an dem Riegel herumwerkeln, was Brams bevorzugter Zustand war und keinen Schaden anrichtete, und ging, um meinen Mann zu suchen.</w:t>
+        <w:t xml:space="preserve">»Ich werde auch draußen gehalten, falls dir das ein Trost ist«, sagte ich ihm, und das schien ihn tatsächlich zu trösten, dieser kleine, etwas schäbige Trost, Gesellschaft in seinem Groll zu haben. Ich ließ ihn produktiv an dem Riegel herumwerkeln, was Brams bevorzugter Zustand war und keinen Schaden anrichtete, und ging, um meinen Mann zu suchen.</w:t>
       </w:r>
     </w:p>
     <w:p>
@@ -2061,7 +2061,7 @@
     </w:p>
     <w:p>
       <w:r>
-        <w:t>»Es ist mit uns heruntergekommen«, sagte er. »Die Magie. Den Teil kennst du ja. Sie gehörte nie dem Nordpol, der Pol war nur der Ort, an dem sie saß. Eine Herdstelle, die sie über sehr lange Zeit glattgeschliffen hatte, ein Ort zum Sein. Und wir sind gegangen, und sie ist mitgekommen, weil sie zu uns gehört oder wir zu ihr, ich war mir nie sicher, in welche Richtung das läuft. Und hier hat sie keine Herdstelle. Keinen abgenutzten Ort, an den sie sich schmiegen kann. Also sprüht sie Funken.« Er nickte hinüber zu dem Städtchen da unten, wo an den fernen Dächern die Festbeleuchtung anging, golden dort, wo sie eigentlich orange hätte sein sollen. »Kleine Dinge, meistens. Lichter, die ihre Farbe wechseln. Ein Riegel, der sich von selbst vorschiebt. Ein Kürbis, der Stechpalme ansetzt. Das tut keinem etwas zuleide, Jess. Sie weiß gar nicht, wie man etwas zuleide tut. Sie ist wie ein Hund, der seinen Menschen verloren hat, der die ganze Straße entlang von Tür zu Tür läuft und an jeder voller Hoffnung ist.«</w:t>
+        <w:t xml:space="preserve">»Es ist mit uns herabgekommen«, sagte er. »Die Magie. Den Teil kennst du ja. Sie gehörte nie dem Nordpol, der Pol war nur der Ort, an dem sie saß. Eine Herdstelle, die sie über sehr lange Zeit glattgeschliffen hatte, ein Ort zum Sein. Und wir sind gegangen, und sie ist mitgekommen, weil sie zu uns gehört oder wir zu ihr, ich war mir nie sicher, in welche Richtung das läuft. Und hier hat sie keine Herdstelle. Keinen abgenutzten Ort, an den sie sich schmiegen kann. Also sprüht sie Funken.« Er nickte hinüber zu dem Städtchen da unten, wo an den fernen Dächern die Festbeleuchtung anging, golden dort, wo sie eigentlich orange hätte sein sollen. »Kleine Dinge, meistens. Lichter, die ihre Farbe wechseln. Ein Riegel, der sich von selbst vorschiebt. Ein Kürbis, der Stechpalme ansetzt. Das tut keinem etwas zuleide, Jess. Sie weiß gar nicht, wie man etwas zuleide tut. Sie ist wie ein Hund, der seinen Menschen verloren hat, der die ganze Straße entlang von Tür zu Tür läuft und an jeder voller Hoffnung ist.«</w:t>
       </w:r>
     </w:p>
     <w:p>
@@ -2101,7 +2101,7 @@
     </w:p>
     <w:p>
       <w:r>
-        <w:t>»Sie folgt dem Geruch«, sagte ich langsam und beobachtete, wie sie da neben dem einzigen Schmiededing im ganzen Haus saß. »Der Zettel riecht nach der Schmiede, und sie ist gegangen und hat das einzige Schmiededing in dieser Küche gefunden und sagt mir, dass sie zusammengehören. Sie verfolgt keine Person, Nick. Das hat sie nie getan. Sie verfolgt einen Ort. Wo immer dieser Zettel gewesen ist, das ist es, was ihre Nase weiß.« Ich blickte auf meinen klugen Vogel hinab. »Pip. Du erzählst mir die Antwort schon seit der ersten Nacht, und ich habe nicht zugehört.«</w:t>
+        <w:t xml:space="preserve">»Sie folgt dem Geruch«, sagte ich langsam und beobachtete, wie sie da neben dem einzigen Schmiededing im ganzen Haus saß. »Der Zettel riecht nach der Schmiede, und sie hat glatt das einzige Schmiededing in dieser Küche gefunden und sagt mir, dass sie zusammengehören. Sie verfolgt keine Person, Nick. Das hat sie nie getan. Sie verfolgt einen Ort. Wo immer dieser Zettel gewesen ist, das ist es, was ihre Nase weiß.« Ich blickte auf meinen klugen Vogel hinab. »Pip. Du erzählst mir die Antwort schon seit der ersten Nacht, und ich habe nicht zugehört.«</w:t>
       </w:r>
     </w:p>
     <w:p>
@@ -2147,7 +2147,7 @@
     </w:p>
     <w:p>
       <w:r>
-        <w:t>Er hatte eine Minute, und er schenkte sie mir von hinter seinem sauberen Schreibtisch aus, ohne sich die Mühe zu machen aufzustehen. Ich legte mich für den Verein ins Zeug, so gut ich konnte. Dass das Dach in die hinteren Räume tropfte. Dass der Heizkessel seinen letzten Winter erlebte. Dass zwei Jahrhunderte der städtischen Geschichte langsam verfielen, weil ein Bruchteil von dem fehlte, was die Stadt für ein einziges Festwochenende ausgab. Ich trug es warm vor, und ich hielt mich kurz. Claire hatte mir erzählt, dass traurige Geschichten kein Geld locker machen, und ich versuchte es mit etwas Beständigem, das schwerer abzuwinken war als bloßes Leid.</w:t>
+        <w:t xml:space="preserve">Er hatte eine Minute, und er schenkte sie mir von hinter seinem sauberen Schreibtisch aus, ohne sich die Mühe zu machen aufzustehen. Ich legte mich für den Verein ins Zeug, so gut ich konnte. Dass das Dach in die hinteren Räume tropfte. Dass der Heizkessel seinen letzten Winter erlebte. Dass zwei Jahrhunderte der städtischen Geschichte langsam verfielen, weil ein Bruchteil von dem fehlte, was die Stadt für ein einziges Festwochenende ausgab. Ich trug es warm vor, und ich hielt mich kurz. Claire hatte mir erzählt, dass traurige Geschichten kein Geld lockermachen, und ich versuchte es mit etwas Beständigem, das schwerer abzuwinken war als bloßes Leid.</w:t>
       </w:r>
     </w:p>
     <w:p>
@@ -2226,7 +2226,7 @@
     </w:p>
     <w:p>
       <w:r>
-        <w:t xml:space="preserve">»Das ist alles«, sagte ich. »Danke, Vera, Sie sehen erschöpft aus, wenn ich mir die Bemerkung erlauben darf. Man lässt Sie hier auch viel zu hart schuften.«</w:t>
+        <w:t xml:space="preserve">»Das ist alles«, sagte ich. »Danke, Vera. Sie sehen erschöpft aus, wenn ich mir die Bemerkung erlauben darf. Man lässt Sie hier auch viel zu hart schuften.«</w:t>
       </w:r>
     </w:p>
     <w:p>
@@ -2267,7 +2267,7 @@
     <w:p/>
     <w:p>
       <w:r>
-        <w:t xml:space="preserve">Der Vorstand des Historischen Vereins trat an jenem Montagabend in dem kalten Hinterzimmer unter dem schadhaften Dach zusammen. Claire hatte mich gebeten, sie zu begleiten, teils weil die Zeitung ein freundliches Gesicht in der Runde haben wollte, und teils, wie ich vermutete, weil sie mehr geahnt als ausgesprochen hatte, was ich bei mir getragen hatte, und wollte, dass ich mit eigenen Augen sah, wie schlimm es stand.</w:t>
+        <w:t xml:space="preserve">Der Vorstand des Historischen Vereins trat an jenem Montagabend in dem kalten Hinterzimmer unter dem schadhaften Dach zusammen. Claire hatte mich gebeten, sie zu begleiten, teils weil die Gazette ein freundliches Gesicht in der Runde haben wollte, und teils, wie ich vermutete, weil sie mehr geahnt als ausgesprochen hatte, was ich mit mir herumtrug, und wollte, dass ich mit eigenen Augen sah, wie schlimm es stand.</w:t>
       </w:r>
     </w:p>
     <w:p>
@@ -2292,7 +2292,7 @@
     </w:p>
     <w:p>
       <w:r>
-        <w:t>Der Zuschuss der Stadt, um ein Drittel gekürzt. Das Dach, für das ein Kostenvoranschlag vorlag, der einen der alten Männer zucken ließ. Der Heizkessel, beanstandet von dem Fachmann, der ihn sich angesehen hatte, welcher – wie Theo berichtete – gemeint habe, er sei überrascht, dass er den letzten Winter überstanden habe. Das Stiftungskapital, das ohnehin spärliche, das zwei Jahre in Folge angezapft worden war, um die Lichter brennen zu lassen, und nun fast aufgebraucht war. Die Mitgliedsbeiträge, die, wie Theo sagte, während er auf sein Blatt und nicht in den Raum blickte, »ungefähr die Kosten für den Kaffee« deckten.</w:t>
+        <w:t xml:space="preserve">Der Zuschuss der Stadt, um ein Drittel gekürzt. Das Dach, für das ein Kostenvoranschlag vorlag, der einen der alten Männer zucken ließ. Der Heizkessel, für nicht mehr betriebssicher erklärt von dem Fachmann, der ihn sich angesehen hatte, welcher – wie Theo berichtete – gemeint habe, er sei überrascht, dass er den letzten Winter überstanden habe. Das Stiftungskapital, das ohnehin spärliche, das zwei Jahre in Folge angezapft worden war, um die Lichter brennen zu lassen, und nun fast aufgebraucht war. Die Mitgliedsbeiträge, die, wie Theo sagte, während er auf sein Blatt und nicht in den Raum blickte, »ungefähr die Kosten für den Kaffee« deckten.</w:t>
       </w:r>
     </w:p>
     <w:p>
@@ -2317,7 +2317,7 @@
     </w:p>
     <w:p>
       <w:r>
-        <w:t>Vera war ebenfalls anwesend, hinten in der Ecke, um das Protokoll zu führen. Das Büro des Bürgermeisteramtes schickte jemanden, um die Sitzungen der Gremien aufzuzeichnen, die es finanzierte, und dieser jemand war Vera mit ihrem Stenoblatt und ihrer zugeknöpften Strickjacke, die alles in ihrer sauberen, schnellen Handschrift niederschrieb. Auch ich beobachtete sie, wann immer es ohne Aufsehen möglich war. Sie schrieb die Zahlen ausdruckslos mit. Doch als Theo die Stelle mit dem Erbärmlichsein erwähnte, mit dem freundlichen Brief, der nein sagte, stockte ihr Stift für einen Moment. Ihr Kiefer spannte sich an. Sie blickte zu dem braunen Fleck an der Decke hinauf, und was über ihr Gesicht huschte, glich am ehesten Kummer oder Angst oder beidem zugleich. Mir fiel nicht ein, worüber eine Frau bei einer Vorstandssitzung, bei der sie lediglich anwesend war, um das Protokoll zu führen, trauern oder wovor sie sich fürchten könnte.</w:t>
+        <w:t xml:space="preserve">Vera war ebenfalls anwesend, hinten in der Ecke, um das Protokoll zu führen. Das Büro des Bürgermeisteramtes schickte jemanden, um die Sitzungen der Gremien aufzuzeichnen, die es finanzierte, und dieser Jemand war Vera mit ihrem Stenoblatt und ihrer zugeknöpften Strickjacke, die alles in ihrer sauberen, schnellen Handschrift niederschrieb. Auch ich beobachtete sie, wann immer es ohne Aufsehen möglich war. Sie schrieb die Zahlen ausdruckslos mit. Doch als Theo die Stelle mit dem Erbärmlichsein erwähnte, mit dem freundlichen Brief, der nein sagte, stockte ihr Stift für einen Moment. Ihr Kiefer spannte sich an. Sie blickte zu dem braunen Fleck an der Decke hinauf, und was über ihr Gesicht huschte, glich am ehesten Kummer oder Angst oder beidem zugleich. Mir fiel nicht ein, worüber eine Frau bei einer Vorstandssitzung, bei der sie lediglich anwesend war, um das Protokoll zu führen, trauern oder wovor sie sich fürchten könnte.</w:t>
       </w:r>
     </w:p>
     <w:p>
@@ -2327,7 +2327,7 @@
     </w:p>
     <w:p>
       <w:r>
-        <w:t>Claire ging davon, um ihre freundliche, traurige Geschichte zu schreiben, die nichts ins Rollen bringen würde. Ich blieb, um Theo zu helfen, und stapelte Stühle zusammen mit dem Mann, den ich verdächtigt hatte, meine Freundin zu erpressen. Er dankte mir dreimal dafür. Dann erzählte er mir von dem Mal im Jahr 1936, als ein Hochwasser fast die ursprünglichen Stadtakten verschlungen hätte und ein Dutzend Bürger eine Menschenkette gebildet hatte, um die Kisten auf höheres Gelände zu schaffen. Das sei die Stadt von ihrer besten Seite gewesen, sagte er, Menschen, die die Vergangenheit mit ihren Händen in Sicherheit brachten, und daran dachte er in den schlimmen Nächten.</w:t>
+        <w:t xml:space="preserve">Claire ging davon, um ihre freundliche, traurige Geschichte zu schreiben, die nichts ins Rollen bringen würde. Ich blieb, um Theo zu helfen, und stapelte Stühle zusammen mit dem Mann, den ich zu verdächtigen begonnen hatte, meine Freundin zu erpressen. Er dankte mir dreimal dafür. Dann erzählte er mir von dem Mal im Jahr 1936, als ein Hochwasser fast die ursprünglichen Stadtakten verschlungen hätte und ein Dutzend Bürger eine Menschenkette gebildet hatte, um die Kisten auf höheres Gelände zu schaffen. Das sei die Stadt von ihrer besten Seite gewesen, sagte er, Menschen, die die Vergangenheit mit ihren Händen in Sicherheit brachten, und daran dachte er in den schlimmen Nächten.</w:t>
       </w:r>
     </w:p>
     <w:p>
@@ -2360,7 +2360,7 @@
     <w:p/>
     <w:p>
       <w:r>
-        <w:t>»Sie würde ihn innerhalb einer Woche in Beschlag nehmen«, sagte ich. »Sie würden nie wieder eine Bahn für sich allein bekommen.«</w:t>
+        <w:t xml:space="preserve">»Sie würde es innerhalb einer Woche in Beschlag nehmen«, sagte ich. »Sie würden nie wieder eine Bahn für sich allein bekommen.«</w:t>
       </w:r>
     </w:p>
     <w:p/>
@@ -2444,7 +2444,7 @@
     <w:p/>
     <w:p>
       <w:r>
-        <w:t>»Er ist ein guter Kerl.« Das Lächeln wurde milder. »Allerdings kreuzunglücklich wegen dieses Ladens, die ganze Zeit über. Man konnte es ihm ansehen. Als wäre das Gebäude ein kranker Verwandter, an dessen Bett er wachte. Er blieb mitten im Satz stehen, während er mir zeigte, wo ich eine Vitrine hinstellen sollte, und starrte einfach nur auf den Wasserfleck an der Decke des Hinterzimmers, als würde der ihn persönlich umbringen.« Er schüttelte den Kopf. »Ich hoffe, irgendjemand hilft ihm. Ich würde ihm das Geld selbst geben, wenn ich welches hätte, aber in diesem Jahr bin ich so ziemlich der am schlechtesten geeignete Mann in dieser Stadt, den man um Geld bitten kann.«</w:t>
+        <w:t xml:space="preserve">»Er ist ein guter Kerl.« Das Lächeln wurde milder. »Allerdings krank vor Sorge wegen dieses Ladens, die ganze Zeit über. Man konnte es ihm ansehen. Als wäre das Gebäude ein kranker Verwandter, an dessen Bett er wachte. Er blieb mitten im Satz stehen, während er mir zeigte, wo ich eine Vitrine hinstellen sollte, und starrte einfach nur auf den Wasserfleck an der Decke des Hinterzimmers, als würde der ihn persönlich umbringen.« Er schüttelte den Kopf. »Ich hoffe, irgendjemand hilft ihm. Ich würde ihm das Geld selbst geben, wenn ich welches hätte, aber in diesem Jahr bin ich so ziemlich der am schlechtesten geeignete Mann in dieser Stadt, den man um Geld bitten kann.«</w:t>
       </w:r>
     </w:p>
     <w:p/>
@@ -2456,7 +2456,7 @@
     <w:p/>
     <w:p>
       <w:r>
-        <w:t>Ich überließ ihn seinem glitzernden Fitnessstudio und seiner mit Plastikfolie behängten Tür. Pip und ich gingen hinaus in die Kälte. Irgendwo zwischen der Tür und der Straßenecke strich ich Jamal Washington in meinem Kopf von der Liste, sanft, so wie man etwas ablegt, dessen Halten man froh ist loszuwerden. Drei Jobs und keine Geheimnisse in ihm. Geldsorgen, denen man im hellen Tageslicht, wo es jeder sehen konnte, ins Gesicht blickte.</w:t>
+        <w:t xml:space="preserve">Ich überließ ihn seinem glitzernden Fitnessstudio und seiner mit Plastikfolie behängten Türöffnung. Pip und ich gingen hinaus in die Kälte. Irgendwo zwischen der Tür und der Straßenecke strich ich Jamal Washington in meinem Kopf von der Liste, sanft, so wie man etwas ablegt, dessen Halten man froh ist loszuwerden. Drei Jobs und keine Geheimnisse in ihm. Geldsorgen, denen man im hellen Tageslicht, wo es jeder sehen konnte, ins Gesicht blickte.</w:t>
       </w:r>
     </w:p>
     <w:p/>
@@ -2479,7 +2479,7 @@
     <w:p/>
     <w:p>
       <w:r>
-        <w:t>Die Magie, die die Saison damit begonnen hatte, eine Lichterkette behutsam golden färben zu lassen, war bis zur Festivalwoche ein wenig mutiger geworden. Ich verbrachte den besseren Teil eines Vormittags damit, den Spuren davon im Ort nachzugehen, im Schlepptau Pip, und das letzte Stück an der Seite von Bram, der mir wortreich sein Leid klagte.</w:t>
+        <w:t xml:space="preserve">Die Magie, die die Saison damit begonnen hatte, eine Lichterkette behutsam golden färben zu lassen, war bis zur Festwoche ein wenig mutiger geworden. Ich verbrachte den größten Teil eines Vormittags damit, den Spuren davon im Ort nachzugehen, im Schlepptau Pip, und das letzte Stück an der Seite von Bram, der mir wortreich sein Leid klagte.</w:t>
       </w:r>
     </w:p>
     <w:p/>
@@ -2491,19 +2491,19 @@
     <w:p/>
     <w:p>
       <w:r>
-        <w:t xml:space="preserve">Greta hielt eine große Schneekugel aus Glas auf dem Tresen der </w:t>
-      </w:r>
-      <w:r>
-        <w:t>Holly Jolly Bakery</w:t>
-      </w:r>
-      <w:r>
-        <w:t/>
-      </w:r>
-      <w:r>
-        <w:t/>
-      </w:r>
-      <w:r>
-        <w:t xml:space="preserve"> bereit, ein Touristenteil mit einem winzigen Keramik-Frost Falls im Inneren, Anger und Rathaus und alles drum und dran. An jenem Morgen, als ich wegen Nicks Zimtschnecken vorbeischaute, wollte der Schnee darin sich einfach nicht setzen. Er wirbelte und wirbelte ohne menschliches Zutun, ein winziger Schneesturm drehte sich unaufhörlich hinter dem Glas. Greta hatte ein Geschirrtuch über die Hälfte davon gebreitet, als ob das helfen würde, und verkaufte ihre Schnecken daneben mit der entschlossenen Fröhlichkeit einer Frau, die beschlossen hatte, nicht über die Schneekugel zu sprechen.</w:t>
+        <w:t xml:space="preserve">Greta hatte eine große Schneekugel aus Glas auf dem Tresen der Holly Jolly Bakery stehen</w:t>
+      </w:r>
+      <w:r>
+        <w:t xml:space="preserve"/>
+      </w:r>
+      <w:r>
+        <w:t xml:space="preserve"/>
+      </w:r>
+      <w:r>
+        <w:t xml:space="preserve"/>
+      </w:r>
+      <w:r>
+        <w:t xml:space="preserve">, ein Touristenteil mit einem winzigen Keramik-Frost Falls im Inneren, Anger und Rathaus und alles drum und dran. An jenem Morgen, als ich wegen Nicks Zimtschnecken vorbeischaute, wollte der Schnee darin sich einfach nicht setzen. Er wirbelte und wirbelte ohne menschliches Zutun, ein winziger Schneesturm drehte sich unaufhörlich hinter dem Glas. Greta hatte ein Geschirrtuch über die Hälfte davon gebreitet, als ob das helfen würde, und verkaufte ihre Schnecken daneben mit der entschlossenen Fröhlichkeit einer Frau, die beschlossen hatte, nicht über die Schneekugel zu sprechen.</w:t>
       </w:r>
     </w:p>
     <w:p/>
@@ -2545,7 +2545,7 @@
     <w:p/>
     <w:p>
       <w:r>
-        <w:t>»Mrs. Claus!« Er drehte sich nicht einmal um. »Es ist diesmal Prancer! Prancer! Sie steht im Brunnen, und da ist nicht mal Wasser drin, sie will einfach nicht raus, und es versammelt sich eine Menschenmenge, und ich habe alles versucht, ich habe es mit Zucker versucht, ich habe es mit Strenge versucht, ich habe versucht, ihr ins Gewissen zu reden, was, wie ich zugebe, optimistisch war.« Er zerrte, aber Prancer blickte ihn mit der gelassenen Gleichgültigkeit eines Geschöpfs an, das nicht im Traum daran dachte, sich wegzubewegen. »Zwei von ihnen sind jetzt draußen. Zwei! Prancer im Brunnen und Vixen ist irgendwie in den Gemeindesaal gelangt und hat das Stroh aus der Krippe gefressen, und es tut ihr nicht einmal leid, man sieht ihr an, dass es ihr nicht leid tut, schau sie dir nur an, oh, sie ist nicht hier, sie ist in der Kirche, aber wenn sie hier wäre, würdest du sehen, dass es ihr nicht leid tut.«</w:t>
+        <w:t xml:space="preserve">»Mrs. Claus!« Er drehte sich nicht einmal um. »Es ist diesmal Prancer! Prancer! Sie steht im Brunnen, und da ist nicht mal Wasser drin, sie will einfach nicht raus, und es versammelt sich eine Menschenmenge, und ich habe alles versucht, ich habe es mit Zucker versucht, ich habe es mit Strenge versucht, ich habe versucht, ihr ins Gewissen zu reden, was, wie ich zugebe, optimistisch war.« Er zerrte, aber Prancer blickte ihn mit der gelassenen Gleichgültigkeit eines Geschöpfs an, das nicht im Traum daran dachte, sich wegzubewegen. »Zwei von ihnen sind jetzt draußen. Zwei! Prancer im Brunnen und Vixen ist irgendwie in den Gemeindesaal gelangt und hat das Stroh aus der Krippe gefressen, und es tut ihr nicht einmal leid, man sieht ihr an, dass es ihr nicht leidtut, schau sie dir nur an, oh, sie ist nicht hier, sie ist in der Kirche, aber wenn sie hier wäre, würdest du sehen, dass es ihr nicht leidtut.«</w:t>
       </w:r>
     </w:p>
     <w:p/>
@@ -2599,13 +2599,13 @@
     <w:p/>
     <w:p>
       <w:r>
-        <w:t>»Nach Hause gerufen«, sagte er. »Nun ja. Das ist wohl kaum das Schlimmste, was ein Tier tun kann. Oder ein Elf.« Er stöhnte. »Ich gehe dann mal und hole Vixen aus der Kirche, bevor sie noch die Krippenfiguren auffrisst.« Er stapfte kopfschüttelnd davon. Die Menge zerstreute sich, die Kinder zeigten noch immer den Weg hinauf, und Mr. Kim klappte seinen Stuhl zusammen, rundum zufrieden.</w:t>
-      </w:r>
-    </w:p>
-    <w:p/>
-    <w:p>
-      <w:r>
-        <w:t xml:space="preserve">Ich ging den Hufabdrücken eines Rentiers nach nach Hause, mit Pip an meiner Seite. Was immer die Magie nun anstellte, sie zog zu einer Herdstelle hin, von der niemand im Ort wusste, dass sie existierte. Genau das hatte Nick gemeint. Die Magie wusste schlicht nicht, wie man Böses tat. Sie wusste nur, wie man nach Hause kam, und sie kam jeden Tag ein kleines Stück näher, während sie kleine, unmögliche Dinge hinterließ: Schnee in einer Kugel, die sich partout nicht setzen wollte, ein Rentier, das aus eigenem Antrieb zu einer Herdstelle nach Hause wanderte, die es noch nie zuvor erblickt hatte.</w:t>
+        <w:t xml:space="preserve">»Nach Hause gerufen«, sagte er. »Nun ja. Das ist wohl kaum das Schlimmste, was ein Tier tun kann. Oder ein Elf.« Er seufzte. »Ich gehe dann mal und hole Vixen aus der Kirche, bevor sie noch die Krippenfiguren auffrisst.« Er stapfte vor sich hin murmelnd davon. Die Menge zerstreute sich, die Kinder zeigten noch immer den Weg hinauf, und Mr. Kim klappte seinen Stuhl zusammen, rundum zufrieden.</w:t>
+      </w:r>
+    </w:p>
+    <w:p/>
+    <w:p>
+      <w:r>
+        <w:t xml:space="preserve">Ich folgte den Hufabdrücken eines Rentiers nach Hause, mit Pip an meiner Seite. Was immer die Magie nun anstellte, sie zog zu einer Herdstelle hin, von der niemand im Ort wusste, dass sie existierte. Genau das hatte Nick gemeint. Die Magie wusste schlicht nicht, wie man Böses tat. Sie wusste nur, wie man nach Hause kam, und sie kam jeden Tag ein kleines Stück näher, während sie kleine, unmögliche Dinge hinterließ: Schnee in einer Kugel, die sich partout nicht setzen wollte, ein Rentier, das aus eigenem Antrieb zu einer Herdstelle nach Hause wanderte, die es noch nie zuvor erblickt hatte.</w:t>
       </w:r>
     </w:p>
     <w:p/>
@@ -2627,7 +2627,7 @@
     </w:p>
     <w:p>
       <w:r>
-        <w:t>Pip und ich trafen als Letzte ein. Der Kreis hatte die Stühle eng um den Holzofen zusammengeschoben, dazwischen standen Körbe mit schulgrüner Wolle auf dem Fußboden. Die fertigen Fäustlinge hingen wie frisch gewaschen auf einer Leine über der Ladentheke. Pip marschierte schnurstracks auf das Gläschen mit den Knöpfen im unteren Regal beim Tresen zu, und Olivia stellte es nach oben auf die Theke, ohne eine einzige Masche fallen zu lassen.</w:t>
+        <w:t xml:space="preserve">Pip und ich trafen als Letzte ein. Der Kreis hatte die Stühle eng um den Holzofen zusammengeschoben, dazwischen standen Körbe mit schulgrüner Wolle auf dem Fußboden. Die fertigen Fäustlinge hingen wie Wäsche auf einer Leine über der Ladentheke. Pip marschierte schnurstracks auf das Gläschen mit den Knöpfen im unteren Regal beim Tresen zu, und Olivia stellte es nach oben auf die Theke, ohne eine einzige Masche fallen zu lassen.</w:t>
       </w:r>
     </w:p>
     <w:p>
@@ -2657,7 +2657,7 @@
     </w:p>
     <w:p>
       <w:r>
-        <w:t xml:space="preserve">Dot strickte an einem Bündchen und zog dabei den Mund kraus. »Alle in dieser Stadt wollen über ein Rentier reden«, sagte sie. »Niemand will darüber reden, dass der Historische Verein schließt.«</w:t>
+        <w:t xml:space="preserve">Dot strickte an einem Bündchen und presste dabei die Lippen aufeinander. »Alle in dieser Stadt wollen über ein Rentier reden«, sagte sie. »Niemand will darüber reden, dass der Historische Verein schließt.«</w:t>
       </w:r>
     </w:p>
     <w:p>
@@ -2742,7 +2742,7 @@
     </w:p>
     <w:p>
       <w:r>
-        <w:t>Ellie hatte wieder leise begonnen, ihre Maschen zu zählen. Am Ende der Reihe sagte sie: »Hat eigentlich irgendjemand Fiona diese Woche gesehen? Sie war bei keiner einzigen Ausschusssitzung. Dabei macht sie doch sonst immer den Kuchenstand.«</w:t>
+        <w:t xml:space="preserve">Ellie hatte wieder leise begonnen, ihre Maschen zu zählen. Am Ende der Reihe sagte sie: »Hat eigentlich irgendjemand Fiona diese Woche gesehen? Sie war bei keiner einzigen Komiteesitzung. Dabei macht sie doch sonst immer den Kuchenstand.«</w:t>
       </w:r>
     </w:p>
     <w:p>
@@ -2762,7 +2762,7 @@
     </w:p>
     <w:p>
       <w:r>
-        <w:t>Das stimmte, soweit es ging. Martha hielt meinen Blick noch einen Moment lang fest und wandte sich dann wieder ihrer Handarbeit zu.</w:t>
+        <w:t xml:space="preserve">Das stimmte, so weit es eben reichte. Martha hielt meinen Blick noch einen Moment lang fest und wandte sich dann wieder ihrer Handarbeit zu.</w:t>
       </w:r>
     </w:p>
     <w:p>
@@ -2799,7 +2799,7 @@
     <w:p/>
     <w:p>
       <w:r>
-        <w:t xml:space="preserve">Ich schrieb die Namen auf die linke Seite des Blattes: Sam. Neil. Jamal. Vera. Theo. Und quer darüber schrieb ich die einzigen zwei Fragen, auf die es ankam – die zwei, die ein Erpresser mit Ja hätte beantworten müssen, und zwar beide, sonst war er es nicht: </w:t>
+        <w:t xml:space="preserve">Ich schrieb die Namen auf die linke Seite des Blattes: Sam. Neil. Jamal. Vera. Theo. Und quer darüber schrieb ich die einzigen zwei Fragen, auf die es ankam – die zwei, die ein Erpresser mit Ja hätte beantworten müssen, und zwar beide, sonst schied die Person aus: </w:t>
       </w:r>
       <w:r>
         <w:rPr>
@@ -2859,7 +2859,7 @@
     <w:p/>
     <w:p>
       <w:r>
-        <w:t xml:space="preserve">Ich zog bei seinem Namen auf dem Blatt die Stirn in Falten. »Das ist derjenige, bei dem ich mir nicht sicher bin. Er weiß alles, was der Erpresser weiß. Die Brosche, den einzelnen Stein, Ridgeline, das ganze Paket. Er ist von der Seite der Blackburns herangegangen, von der Seite der Nachlassanwälte, und hat es fast bis vor Constances Haustür zurückverfolgt.« Ich drehte meine Tasse langsam eine halbe Drehung auf dem Tisch. »Aber er erzählt es jedem. Er verteilt Visitenkarten. Er saß in der öffentlichen Bibliothek und hat mir die ganze Geschichte erzählt, bevor ich überhaupt danach gefragt hatte. Ein Erpresser versteckt sich, Nick. Seine ganze Macht liegt im Versteckspiel. Und Neil Carter tut das genaue Gegenteil vom Verstecken, zu jeder Stunde des Tages. Entweder ist er also überhaupt nicht unser Mann, oder er ist der Schlaueste von allen und macht so viel ehrlichen Lärm um die Brosche, dass kein Mensch in der Stadt jemals zweimal auf denjenigen schauen würde, der am meisten darüber redet.« Ich ließ ein Fragezeichen neben Neil stehen. »Ich bin noch nicht so weit, ihn abzuschreiben. Aber das sage ich dir: Er kennt das Geheimnis, und er ist auf ehrliche Weise daran gelangt, und er ist Fiona nie wegen ein paar Groschen auf die Pelle gerückt. Er hat sie im hellen Tageslicht mit einem Notizbuch in der Hand wegen Antworten aufgesucht.«</w:t>
+        <w:t xml:space="preserve">Ich zog bei seinem Namen auf dem Blatt die Stirn in Falten. »Das ist derjenige, bei dem ich mir nicht sicher bin. Er weiß alles, was der Erpresser weiß. Die Brosche, den einzelnen Stein, Ridgeline, das ganze Paket. Er ist von der Seite der Blackburns herangegangen, von der Seite der Nachlassanwälte, und hat es fast bis vor Constances Haustür zurückverfolgt.« Ich drehte meine Tasse langsam eine halbe Drehung auf dem Tisch. »Aber er erzählt es jedem. Er verteilt Visitenkarten. Er saß in der öffentlichen Bibliothek und hat mir die ganze Geschichte erzählt, bevor ich überhaupt danach gefragt hatte. Ein Erpresser versteckt sich, Nick. Seine ganze Macht liegt im Versteckspiel. Und Neil Carter tut das genaue Gegenteil vom Verstecken, zu jeder Stunde des Tages. Entweder ist er also überhaupt nicht unser Mann, oder er ist der Schlaueste von allen und macht so viel ehrlichen Lärm um die Brosche, dass kein Mensch in der Stadt jemals zweimal auf denjenigen schauen würde, der am meisten darüber redet.« Ich ließ ein Fragezeichen neben Neil stehen. »Ich bin noch nicht so weit, ihn abzuschreiben. Aber das sage ich dir: Er kennt das Geheimnis, und er ist auf ehrliche Weise daran gelangt, und er ist Fiona nie wegen eines einzigen Cents auf die Pelle gerückt. Er hat sie im hellen Tageslicht mit einem Notizbuch in der Hand wegen Antworten aufgesucht.«</w:t>
       </w:r>
     </w:p>
     <w:p/>
@@ -2895,7 +2895,7 @@
     <w:p/>
     <w:p>
       <w:r>
-        <w:t xml:space="preserve">»Dann stelle sie auf die Probe«, sagte Nick, »anstatt hier in der Küche zu sitzen und dich davor zu fürchten, was noch nie etwas gelöst hat und es auch nie tun wird. Geh und sieh dir das Einzige an, das du dir noch nicht richtig angesehen hast. Die Briefe selbst oder den Ort, an dem sie sein müssten.« Er streckte die Hand über den Tisch aus und legte seine warme Hand flach über meine kalte. »Theo könnte ein paar helfende Hände gebrauchen, um dieses Archiv in Ordnung zu bringen. Geh und biete sie ihm an. Und während du hilfst, finde eine einzige Sache heraus: ob die Worte in jenem Zettel mit den Worten in den Briefen übereinstimmen, die verschwunden sind. Denn wenn sie das tun, Jess, dann hat derjenige, der den Zettel geschrieben hat, nicht nur ganz allgemein die Blackburn-Papiere gelesen. Er hatte genau diese Briefe in seinen Händen. Und es gibt einen sehr kleinen Kreis von Leuten in Frost Falls, von denen sich das sagen lässt.«</w:t>
+        <w:t xml:space="preserve">»Dann stelle sie auf die Probe«, sagte Nick, »anstatt hier in der Küche zu sitzen und dich davor zu fürchten, was noch nie etwas gelöst hat und es auch nie tun wird. Geh und sieh dir das Einzige an, das du dir noch nicht richtig angesehen hast. Die Briefe selbst oder den Ort, an dem sie sein müssten.« Er streckte die Hand über den Tisch aus und legte seine warme Hand flach über meine kalte. »Theo könnte ein paar helfende Hände gebrauchen, um dieses Archiv in Ordnung zu bringen. Geh und biete sie ihm an. Und während du hilfst, finde eine einzige Sache heraus: ob die Worte in jenem Zettel mit den Worten in den Briefen übereinstimmen, die verschwunden sind. Denn wenn sie das tun, Jess, dann hat, wer immer den Zettel geschrieben hat, nicht nur ganz allgemein die Blackburn-Papiere gelesen. Diese Person hatte genau diese Briefe in den Händen. Und es gibt einen sehr kleinen Kreis von Leuten in Frost Falls, von denen sich das sagen lässt.«</w:t>
       </w:r>
     </w:p>
     <w:p/>
@@ -2913,7 +2913,7 @@
     <w:p/>
     <w:p>
       <w:r>
-        <w:t>»Bald also«, stimmte Nick zu. Und dann, weil er mich bis auf den Grund meiner Seele kannte, fügte er hinzu: »Und Jess. Was immer du in diesem Archiv findest, wenn es so weit ist: Die Wahrheit herauszufinden und zu entscheiden, was man damit anfängt, sind zwei verschiedene Dinge, und du musst erst einmal nur das Erstere tun. Du kannst herausfinden, dass es Theo ist, und danach trotzdem noch entscheiden, wie es ausgeht. Lass dir von den Entdeckungen keine Angst einjagen, dass das Ende bereits geschrieben wäre.«</w:t>
+        <w:t xml:space="preserve">»Bald also«, stimmte Nick zu. Und dann, weil er mich bis auf den Grund meiner Seele kannte, fügte er hinzu: »Und Jess. Was immer du in diesem Archiv findest, wenn es so weit ist: Die Wahrheit herauszufinden und zu entscheiden, was man damit anfängt, sind zwei verschiedene Dinge, und du musst erst einmal nur das Erstere tun. Du kannst herausfinden, dass es Theo ist, und danach trotzdem noch entscheiden, wie es ausgeht. Lass dich vom Finden nicht so erschrecken, dass du glaubst, das Ende stehe schon fest.«</w:t>
       </w:r>
     </w:p>
     <w:p/>
@@ -2935,7 +2935,7 @@
     </w:p>
     <w:p>
       <w:r>
-        <w:t>Er war nicht in der Schmiede. Er stand im Gasthof auf einer Leiter an der Veranda und befestigte die letzten Eisenwinkel; er hatte eine Handvoll Schrauben im Mund und eine Wasserwaage auf dem Geländer balanciert. Er kam herunter, als er mich auf dem Gehweg sah, misstrauisch. Das letzte Mal, als wir gesprochen hatten, war ich um ihn herumgeschlichen, ohne es auszusprechen, und er hatte es gespürt, selbst wenn er es nicht hätte benennen können.</w:t>
+        <w:t xml:space="preserve">Er war nicht in der Schmiede. Er stand im Gasthof auf einer Leiter an der Veranda und befestigte die letzten eisernen Halterungen; er hatte eine Handvoll Schrauben im Mund und eine Wasserwaage auf dem Geländer balanciert. Er kam herunter, als er mich auf dem Gehweg sah, misstrauisch. Das letzte Mal, als wir gesprochen hatten, war ich um ihn herumgeschlichen, ohne es auszusprechen, und er hatte es gespürt, selbst wenn er es nicht hätte benennen können.</w:t>
       </w:r>
     </w:p>
     <w:p>
@@ -2975,7 +2975,7 @@
     </w:p>
     <w:p>
       <w:r>
-        <w:t>»Was kann ich tun?« Er sagte es, wie Jamal es gesagt hatte, wie die ganze Stadt es sagte, sobald man sie durch die Tür ließ, und die Ärmel hochkrempelte, noch bevor die Frage ausgesprochen war. »Ich bin jeden Tag hier im Gasthof und mache die Eisenarbeiten fertig. Ich bin genau hier. Sagen Sie mir, worauf ich achten soll. Sagen Sie mir, wer.«</w:t>
+        <w:t xml:space="preserve">»Was kann ich tun?« Er sagte es, wie Jamal es gesagt hatte, wie die ganze Stadt es sagte, sobald man sie durch die Tür ließ – die Ärmel schon hochgekrempelt, noch bevor die Frage ausgesprochen war. »Ich bin jeden Tag hier im Gasthof und mache die Eisenarbeiten fertig. Ich bin genau hier. Sagen Sie mir, worauf ich achten soll. Sagen Sie mir, wer.«</w:t>
       </w:r>
     </w:p>
     <w:p>
@@ -2985,12 +2985,12 @@
     </w:p>
     <w:p>
       <w:r>
-        <w:t xml:space="preserve">Der Geruch auf dem Zettel war nie Sams gewesen. Es war seine Arbeit gewesen. Ein Schmied vollendet Eisen, indem er Öl hineinbrennt, solange es noch heiß ist, und neue Eisenarbeiten tragen diesen Rauch wochenlang in sich. Fionas Lobby war voll davon, das Treppengeländer, der Funkenschirm, die Halterungen, die an der Veranda angebracht wurden, und Sams Mantel und Werkzeugtasche hatten drei Wochen lang jeden Tag an ihrer Tür gehangen. Jedes Papier, das auf diesem Schreibtisch lag, nahm den Geruch an. Der Zettel hatte ebenfalls dort gelegen. Der Hinweis, der ihn ganz nach oben auf meine Liste gebracht hatte, hatte mir die ganze Zeit über verraten, wo der Zettel gewesen war. Nicht, wer ihn geschrieben hatte. Ich hatte ihn rückwärts gelesen. Jetzt konnte ich ihn richtig herum lesen, und richtig herum entlastete er ihn vollständig und rein.</w:t>
-      </w:r>
-    </w:p>
-    <w:p>
-      <w:r>
-        <w:t xml:space="preserve">»Achten Sie auf den Empfangsschreibtisch«, sagte ich ihm, da er gefragt hatte und da er sich eine ehrliche Antwort mehr als verdient hatte. »Das Fest ist an diesem Wochenende, und der Gasthof wird den ganzen Tag über voller Fremder sein, die ein- und ausgehen. Wenn jemand etwas auf diesem Schreibtisch abgibt und schnell verschwindet, inmitten all der Menschen, prägen Sie sich für mich das Gesicht ein. Sie haben scharfe Augen, und Sie werden ohnehin hier auf dieser Leiter stehen. Das ist alles, was ich will. Halten Sie sie nicht auf, sagen Sie kein Wort, lassen Sie sich nichts anmerken. Merken Sie sich einfach das Gesicht.«</w:t>
+        <w:t xml:space="preserve">Der Geruch auf dem Zettel war nie Sams gewesen. Es war seine Arbeit gewesen. Ein Schmied vollendet Eisen, indem er Öl hineinbrennt, solange es noch heiß ist, und neue Eisenarbeiten tragen diesen Rauch wochenlang in sich. Fionas Lobby war voll davon, das Treppengeländer, der Funkenschirm, die Halterungen, die an der Veranda angebracht wurden, und Sams Mantel und Werkzeugtasche hatten drei Wochen lang jeden Tag an ihrer Tür gehangen. Jedes Papier, das auf diesem Tresen lag, nahm den Geruch an. Der Zettel hatte ebenfalls dort gelegen. Der Hinweis, der ihn ganz nach oben auf meine Liste gebracht hatte, hatte mir die ganze Zeit über verraten, wo der Zettel gewesen war. Nicht, wer ihn geschrieben hatte. Ich hatte ihn rückwärts gelesen. Jetzt konnte ich ihn richtig herum lesen, und richtig herum entlastete er ihn vollständig und rein.</w:t>
+      </w:r>
+    </w:p>
+    <w:p>
+      <w:r>
+        <w:t xml:space="preserve">»Achten Sie auf den Empfangstresen«, sagte ich ihm, da er gefragt hatte und da er sich eine ehrliche Antwort mehr als verdient hatte. »Das Fest ist an diesem Wochenende, und der Gasthof wird den ganzen Tag über voller Fremder sein, die ein- und ausgehen. Wenn jemand etwas auf diesem Tresen abgibt und schnell verschwindet, inmitten all der Menschen, prägen Sie sich für mich das Gesicht ein. Sie haben scharfe Augen, und Sie werden ohnehin hier auf dieser Leiter stehen. Das ist alles, was ich will. Halten Sie sie nicht auf, sagen Sie kein Wort, lassen Sie sich nichts anmerken. Merken Sie sich einfach das Gesicht.«</w:t>
       </w:r>
     </w:p>
     <w:p>
@@ -3000,7 +3000,7 @@
     </w:p>
     <w:p>
       <w:r>
-        <w:t>Ich versprach es ihm, beides, und überließ ihn seinen Winkeln. Pip gab die Schrauben nur sehr widerwillig her, und sie und ich gingen die helle, kalte Straße wieder zurück. Irgendwo zwischen dem Gasthof und der Straßenecke strich ich Sam Patel in meinem Kopf von der Liste und war froh darüber. Ein Name weniger. Noch ein guter Mensch, der sich in dem Moment, in dem ich ihn einließ, von einem Riss in der Mauer um Fiona in einen weiteren Stein derselben verwandelte.</w:t>
+        <w:t xml:space="preserve">Ich versprach es ihm, beides, und überließ ihn seinen Halterungen. Pip gab die Schrauben nur sehr widerwillig her, und sie und ich gingen die helle, kalte Straße wieder zurück. Irgendwo zwischen dem Gasthof und der Straßenecke strich ich Sam Patel in meinem Kopf von der Liste und war froh darüber. Ein Name weniger. Noch ein guter Mensch, der sich in dem Moment, in dem ich ihn einließ, von einem Riss in der Mauer um Fiona in einen weiteren Stein derselben verwandelte.</w:t>
       </w:r>
     </w:p>
     <w:p>
@@ -3020,7 +3020,7 @@
     </w:p>
     <w:p>
       <w:r>
-        <w:t xml:space="preserve">»Echte Kanzlei«, sagte sie, noch bevor ich überhaupt Hallo sagen konnte. »Alte Kanzlei, zwei Bundesstaaten weiter, macht genau das, was er behauptet: Nachlass- und Erbsachen sowie die Suche nach verlorenem Eigentum für Anwälte, die mehr Geld als Zeit haben. Und es gibt tatsächlich einen Nachlass Blackburn, Jessica, einen echten, aktuell laufenden. Der letzte Ast von Adelaide Blackburns Linie ist diesen Frühling in der Großstadt gestorben, keine Kinder, kein nennenswertes Testament und ein heilloses Chaos. Unser Bürgermeister stammt aus der Verwandtschaft, von dem Zweig, der die Nase abbekommen hat, aber keinen Cent. Er hat damit nichts zu tun. Carter steht in den Büchern der Kanzlei als der Ermittler, den sie angeheuert haben, um das aufzudröseln. Ich habe es von einer Angestellten, die das Ganze bestätigte, ohne auch nur ein einziges Mal zu merken, dass sie etwas bestätigte. Er ist genau der, als den er sich dir vorgestellt hat. Ein Schnüffler mit Lizenz und Spesenkonto.«</w:t>
+        <w:t xml:space="preserve">»Echte Kanzlei«, sagte sie, noch bevor ich überhaupt Hallo sagen konnte. »Alte Kanzlei, zwei Bundesstaaten weiter, macht genau das, was er behauptet: Nachlass- und Erbsachen sowie die Suche nach verlorenem Eigentum für Anwälte, die mehr Geld als Zeit haben. Und es gibt tatsächlich einen Nachlass Blackburn, Jessica, einen echten, aktuell laufenden. Der letzte Nachkomme aus Adelaide Blackburns Linie ist diesen Frühling in der Großstadt gestorben, keine Kinder, kein nennenswertes Testament und ein heilloses Chaos. Unser Bürgermeister stammt aus der Verwandtschaft, von dem Zweig, der die Nase abbekommen hat, aber keinen Cent. Er hat damit nichts zu tun. Carter steht in den Büchern der Kanzlei als der Ermittler, den sie angeheuert haben, um das aufzudröseln. Ich habe es von einer Angestellten, die das Ganze bestätigte, ohne auch nur ein einziges Mal zu merken, dass sie etwas bestätigte. Er ist genau der, als den er sich dir vorgestellt hat. Ein Schnüffler mit Lizenz und Spesenkonto.«</w:t>
       </w:r>
     </w:p>
     <w:p>
@@ -3170,7 +3170,7 @@
     <w:p/>
     <w:p>
       <w:r>
-        <w:t>Ich erstarrte. Ich hatte mir in meinem langen Leben antrainiert, mich von meinem Körper nicht verraten zu lassen, und ich brauchte damals jeden Hauch dieses Trainings, als ich an Theos Arbeitstisch saß und seine Karte in der Hand hielt, denn der in meinen Mantel gefaltete Erpresserzettel enthielt genau dieselben Wörter. Nicht ähnliche Wörter. Diese Wörter. Ich brauchte den Zettel nicht hervorzuholen, um sicher zu sein; ich hatte ihn hundertmal gelesen und sah ihn vor meinem inneren Auge. Der Saphir in ihrem Herzen. Es war eine merkwürdige Art, eine Brosche zu beschreiben, ein Hauch von Poesie, die Formulierung eines Historikers und nicht die eines Diebs. Er stand im Erpresserzettel genau so wie auf Theos Karte, dieselben fünf Wörter in derselben Reihenfolge. Zwei Menschen beschreiben ein Schmuckstück nicht durch Zufall mit denselben fünf seltsamen Wörtern.</w:t>
+        <w:t xml:space="preserve">Ich erstarrte. Ich hatte mir in meinem langen Leben antrainiert, mich von meinem Körper nicht verraten zu lassen, und ich brauchte damals jeden Hauch dieses Trainings, als ich an Theos Arbeitstisch saß und seine Karte in der Hand hielt, denn der in meinen Mantel gefaltete Erpresserzettel enthielt genau dieselben Wörter. Nicht ähnliche Wörter. Diese Wörter. Ich brauchte den Zettel nicht hervorzuholen, um sicher zu sein; ich hatte ihn hundertmal gelesen und sah ihn vor meinem inneren Auge. Der Saphir in ihrem Herzen. Es war eine merkwürdige Art, eine Brosche zu beschreiben, ein Hauch von Poesie, die Formulierung eines Historikers und nicht die eines Diebs. Die Wendung stand im Erpresserzettel genau so wie auf Theos Karte, dieselben fünf Wörter in derselben Reihenfolge. Zwei Menschen beschreiben ein Schmuckstück nicht durch Zufall mit denselben fünf seltsamen Wörtern.</w:t>
       </w:r>
     </w:p>
     <w:p/>
@@ -3224,7 +3224,7 @@
     <w:p/>
     <w:p>
       <w:r>
-        <w:t xml:space="preserve">»Ich weiß, dass es von ihm oder durch ihn kam.« Meine Stimme klang rau. »Ich weiß, dass derjenige, der diesen Zettel geschrieben hat, Theos eigene Worte über die Brosche gelesen hat. Und ich weiß, dass es nur eine kurze Liste von Leuten gibt, die das gekonnt hätten, und sein Name steht ganz oben drauf, mit Rotstift, in seiner eigenen Handschrift.« Ich zog die Decke enger um mich. »Ich sehe ihn immer noch vor mir, wie er eben an der Tür stand. Vierzig neue Mitglieder. So glücklich. Nick, wie macht ein Mann so etwas? Wie kann er Fiona im Dunkeln das antun und morgens den Kindern ihren Kakao bringen und beides ernst meinen, in derselben Woche, mit denselben Händen?«</w:t>
+        <w:t xml:space="preserve">»Ich weiß, dass es von ihm oder durch ihn kam.« Meine Stimme klang rau. »Ich weiß, dass, wer immer diesen Zettel geschrieben hat, Theos eigene Worte über die Brosche gelesen hat. Und ich weiß, dass es nur eine kurze Liste von Leuten gibt, die das gekonnt hätten, und sein Name steht ganz oben drauf, mit Rotstift, in seiner eigenen Handschrift.« Ich zog die Decke enger um mich. »Ich sehe ihn immer noch vor mir, wie er eben an der Tür stand. Vierzig neue Mitglieder. So glücklich. Nick, wie macht ein Mann so etwas? Wie kann er Fiona im Dunkeln das antun und morgens den Kindern ihren Kakao bringen und beides ernst meinen, in derselben Woche, mit denselben Händen?«</w:t>
       </w:r>
     </w:p>
     <w:p/>
@@ -3272,7 +3272,7 @@
     <w:p/>
     <w:p>
       <w:r>
-        <w:t xml:space="preserve">In der Mitte des Raumes, wo der alte Herd am Pol gestanden hätte, hatte er einen großen Kamin aus Feldsteinen errichtet, runde Flusssteine, einer auf den anderen von Hand aufgeschichtet. Es brannte kein Feuer darin. Der Rost blieb kalt und leer, und dennoch glühte er. Das warme Gold strömte aus dem nackten Stein selbst hervor. Der heimatlose Zauber, der von Haus zu Haus durch ganz Frost Falls gezogen war, hatte sich zum Teil hier eingefunden und zog langsame Kreise in der warmen Luft über dem leeren Rost, wie ein müdes Geschöpf, das endlich einen Ort gefunden hat, an dem es sich vielleicht eines Tages niederlegen darf.</w:t>
+        <w:t xml:space="preserve">In der Mitte des Raumes, wo der alte Herd am Pol gestanden hätte, hatte er einen großen Kamin aus Feldsteinen errichtet, runde Flusssteine, einer auf den anderen von Hand aufgeschichtet. Es brannte kein Feuer darin. Der Rost blieb kalt und leer, und dennoch glühte er. Das warme Gold strömte aus dem nackten Stein selbst hervor. Die heimatlose Magie, die von Haus zu Haus durch ganz Frost Falls gezogen war, hatte sich zum Teil hier eingefunden und zog langsame Kreise in der warmen Luft über dem leeren Rost, wie ein müdes Geschöpf, das endlich einen Ort gefunden hat, an dem es sich vielleicht eines Tages niederlegen darf.</w:t>
       </w:r>
     </w:p>
     <w:p/>
@@ -3284,13 +3284,13 @@
     <w:p/>
     <w:p>
       <w:r>
-        <w:t xml:space="preserve">»Eine Herdstelle.« Sein Arm legte sich um mich. »Sie ist noch nicht fertig. Sie kann es noch nicht halten, noch nicht ganz, nicht für immer. Das ist jahrelange Arbeit, Jess. Aber es ist ein Anfang. Ein Ort, an den er kommen kann. Damit er aufhört, das Dunkel zu durchstreifen.« Er blickte auf mich herab, und das goldene Licht spielte auf seinem Gesicht. »Ich wollte, dass du es heute Abend siehst, weil du eine schreckliche Last trägst, und ich nicht wollte, dass du durch die Gegend läufst und denkst, die ganze Welt bestehe nur aus Menschen, die im Dunkeln Unheil anrichten. Einige von uns sind eben auch draußen im Dunkeln und bauen Orte, an denen die Wärme landen kann.«</w:t>
-      </w:r>
-    </w:p>
-    <w:p/>
-    <w:p>
-      <w:r>
-        <w:t xml:space="preserve">Ich stand im Schein des unentzündeten Feuers und erlaubte mir schließlich, ein wenig zu weinen – um Theo, um Fiona und um das ganze schreckliche, verwickelte Durcheinander. Nick hielt mich fest. Über uns zog der Zauber seine langsamen goldenen Kreise, auf der Suche nach einer Heimat, und fing gerade erst an, sie zu finden.</w:t>
+        <w:t xml:space="preserve">»Eine Herdstelle.« Sein Arm legte sich um mich. »Sie ist noch nicht fertig. Sie kann es noch nicht halten, noch nicht ganz, nicht für immer. Das ist jahrelange Arbeit, Jess. Aber es ist ein Anfang. Ein Ort, an den sie kommen kann. Damit sie aufhört, das Dunkel zu durchstreifen.« Er blickte auf mich herab, und das goldene Licht spielte auf seinem Gesicht. »Ich wollte, dass du es heute Abend siehst, weil du eine schreckliche Last trägst, und ich nicht wollte, dass du durch die Gegend läufst und denkst, die ganze Welt bestehe nur aus Menschen, die im Dunkeln Unheil anrichten. Einige von uns sind eben auch draußen im Dunkeln und bauen Orte, an denen die Wärme landen kann.«</w:t>
+      </w:r>
+    </w:p>
+    <w:p/>
+    <w:p>
+      <w:r>
+        <w:t xml:space="preserve">Ich stand im Schein des unentzündeten Feuers und erlaubte mir schließlich, ein wenig zu weinen – um Theo, um Fiona und um das ganze schreckliche, verwickelte Durcheinander. Nick hielt mich fest. Über uns zog die Magie ihre langsamen goldenen Kreise, auf der Suche nach einer Heimat, und fing gerade erst an, sie zu finden.</w:t>
       </w:r>
     </w:p>
     <w:p/>
@@ -3374,7 +3374,7 @@
     </w:p>
     <w:p>
       <w:r>
-        <w:t xml:space="preserve">»Nein«, sagte ich, während ich den Zettel in meinen Händen wendete und ihn noch einmal las. »Er will, dass du so verängstigt bist, dass du auftreibst, was es nicht gibt. Leute, die nie wirklich verzweifelt waren, glauben, die Verzweifelten könnten sich irgendwie immer Geld herbeizaubern, wenn man sie nur fest genug auspresst. Er glaubt, es gibt eine reiche Verwandtschaft, um die zu bitten du zu stolz warst. Er glaubt, du wirst etwas verkaufen, etwas beleihen, zu den Worthingtons auf die Knie gehen. Er glaubt, die Angst selbst wird das Geld locker machen wie Münzen aus einer Tasche, die man auf den Kopf stellt.« Ich blickte zu ihr auf. »Und das verrät mir etwas über ihn, Fiona, ob er es nun verraten wollte oder nicht. Es verrät mir, dass er ebenfalls verzweifelt ist. Wohlhabende Leute stellen sich nicht vor, dass Geld unter Druck entsteht, weil Geld für sie noch nie entstehen musste, es war einfach immer da. Nur jemand, der es in einem harten Monat irgendwie hat herbeischaffen müssen, denkt so. Der Zettel hat mich tagelang an deiner Stelle in Angst versetzt. Erst jetzt kommt mir der Gedanke, ein wenig auch um ihn zu bangen, wer immer er auch sein mag.«</w:t>
+        <w:t xml:space="preserve">»Nein«, sagte ich, während ich den Zettel in meinen Händen wendete und ihn noch einmal las. »Er will, dass du so verängstigt bist, dass du auftreibst, was es nicht gibt. Leute, die nie wirklich verzweifelt waren, glauben, die Verzweifelten könnten sich irgendwie immer Geld herbeizaubern, wenn man sie nur fest genug auspresst. Er glaubt, es gibt eine reiche Verwandtschaft, um die zu bitten du zu stolz warst. Er glaubt, du wirst etwas verkaufen, etwas beleihen, zu den Worthingtons auf die Knie gehen. Er glaubt, die Angst selbst wird das Geld lockermachen wie Münzen aus einer Tasche, die man auf den Kopf stellt.« Ich blickte zu ihr auf. »Und das verrät mir etwas über ihn, Fiona, ob er es nun verraten wollte oder nicht. Es verrät mir, dass er ebenfalls verzweifelt ist. Wohlhabende Leute stellen sich nicht vor, dass Geld unter Druck entsteht, weil Geld für sie noch nie entstehen musste, es war einfach immer da. Nur jemand, der es in einem harten Monat irgendwie hat herbeischaffen müssen, denkt so. Der Zettel hat mich tagelang um deinetwillen in Angst versetzt. Erst jetzt kommt mir der Gedanke, ein wenig auch um ihn zu bangen, wer immer er auch sein mag.«</w:t>
       </w:r>
     </w:p>
     <w:p>
@@ -3433,7 +3433,7 @@
     </w:p>
     <w:p>
       <w:r>
-        <w:t>Aber jemand anderes konnte das. Jemand, der sich so unauffällig durch diese Stadt bewegte, dass kein Blick jemals an ihm hängen blieb, der im Trubel des Festes kurz am Gasthof vorbeischauen, etwas ablegen, weitergehen konnte und keine Spur hinterließ. Ich konnte nicht erkennen, wer das sein mochte. Aber mit zwei Zetteln in meiner Hand ahnte ich zum ersten Mal, dass die Hand, die diese geschrieben hatte, und die Hand, die sie in die Lobby getragen hatte, vielleicht gar nicht dieselbe Hand waren.</w:t>
+        <w:t xml:space="preserve">Aber jemand anderes konnte das. Jemand, der sich so unauffällig durch diese Stadt bewegte, dass kein Blick jemals an dieser Person hängen blieb, jemand, der im Trubel des Festes kurz am Gasthof vorbeischauen, etwas ablegen, weitergehen konnte und keine Spur hinterließ. Ich konnte nicht erkennen, wer das sein mochte. Aber mit zwei Zetteln in meiner Hand ahnte ich zum ersten Mal, dass die Hand, die diese geschrieben hatte, und die Hand, die sie in die Lobby getragen hatte, vielleicht gar nicht dieselbe Hand waren.</w:t>
       </w:r>
     </w:p>
     <w:p>
@@ -3478,7 +3478,7 @@
     </w:p>
     <w:p>
       <w:r>
-        <w:t xml:space="preserve">Auf der einen Ebene war ich einfach da, eine Stadtbewohnerin auf dem Fest ihrer Gemeinde, und das war herrlich. Emma Redfern spürte mich am Apfelsaftstand auf und präsentierte stolz ihr Kostüm, das sie unbedingt einen Tag zu früh hatte anziehen wollen: eine Sternbild-Verkleidung als Orion, ganz in Schwarz, mit silbernen Sternen, die von der sorgsamen Hand ihres Vaters exakt an die richtigen Stellen genäht worden waren, der Gürtel saß haargenau. Sie wollte, dass ich jeden einzelnen Stern benannte, und das tat ich, denn ich kannte diese Sterne schon sehr lange. Sie war hellauf begeistert, dass Mrs. Claus ihre Sternbilder kannte. Mark stand mit zwei Bechern Apfelsaft daneben und dem weichen Blick eines Vaters, der dabei zuschaut, wie seine Tochter mitten in einer Menschenmenge acht Jahre alt ist. Martha drückte mir vom Tisch ein Paar Fäustlinge in die Hand, die grünen, »für deine kalten Hände«. Sam Patel hob von der anderen Seite des Angers grüßend den Hut von seinem Posten nahe der Gasthofveranda aus, wo er sich den ganzen Tag über positioniert hatte, mit den Augen fest auf den Empfangstresen direkt hinter der Tür gerichtet, worum ich ihn gebeten hatte.</w:t>
+        <w:t xml:space="preserve">Auf der einen Ebene war ich einfach da, eine Stadtbewohnerin auf dem Fest ihrer Gemeinde, und das war herrlich. Emma Redfern spürte mich am Apfelsaftstand auf und präsentierte stolz ihr Kostüm, das sie unbedingt einen Tag zu früh hatte anziehen wollen: eine Sternbild-Verkleidung als Orion, ganz in Schwarz, mit silbernen Sternen, die von der sorgsamen Hand ihres Vaters exakt an die richtigen Stellen genäht worden waren, der Gürtel saß haargenau. Sie wollte, dass ich jeden einzelnen Stern benannte, und das tat ich, denn ich kannte diese Sterne schon sehr lange. Sie war hellauf begeistert, dass Mrs. Claus ihre Sternbilder kannte. Mark stand mit zwei Bechern Apfelsaft daneben und dem weichen Blick eines Vaters, der dabei zuschaut, wie seine Tochter mitten in einer Menschenmenge acht Jahre alt ist. Martha drückte mir vom Tisch ein Paar Fäustlinge in die Hand, die grünen, »für deine kalten Hände«. Sam Patel hob von der anderen Seite des Angers grüßend die Mütze von seinem Posten nahe der Gasthofveranda aus, wo er sich den ganzen Tag über positioniert hatte, mit den Augen fest auf den Empfangstresen direkt hinter der Tür gerichtet, worum ich ihn gebeten hatte.</w:t>
       </w:r>
     </w:p>
     <w:p>
@@ -3533,7 +3533,7 @@
     </w:p>
     <w:p>
       <w:r>
-        <w:t xml:space="preserve">Die Magie war an diesem Tag allgegenwärtig, auf kleine Weisen, die die Stadt einfach abtun konnte. Als die Kapelle einen Reigen spielte, schwankten die Laternen in den Bäumen ein wenig, obwohl ich keinen Wind spürte. Frostfarne wuchsen an den Innenseiten der Gasthoffenster in Mustern empor, die viel zu lieblich waren, als dass sie ein Zufall sein könnten, schmolzen dahin und wuchsen wieder nach. Und in der letzten Stunde des Tageslichts, als die Sonne hinter den Hügeln unterging und die goldenen Festlichter voll zur Geltung kamen, begann es sanft zu schneien, zum ersten Mal seit der Woche, in der wir Snowball gefunden hatten. Dicke, langsame Flocken trieben über den Anger, über die Kapelle, die Buden und die zugewandten Gesichter. Die ganze Stadt hielt inne, wie auf ein geheimes Kommando, blickte nach oben und wurde still.</w:t>
+        <w:t xml:space="preserve">Die Magie war an diesem Tag allgegenwärtig, auf kleine Weisen, die die Stadt einfach abtun konnte. Als die Kapelle einen Reigen spielte, schwankten die Laternen in den Bäumen ein wenig, obwohl ich keinen Wind spürte. Frostfarne wuchsen an den Innenseiten der Gasthoffenster in Mustern empor, die viel zu lieblich waren, als dass sie ein Zufall sein könnten, schmolzen dahin und wuchsen wieder nach. Und in der letzten Stunde des Tageslichts, als die Sonne hinter den Hügeln unterging und die goldenen Festlichter voll zur Geltung kamen, begann es sanft zu schneien, zum ersten Mal seit der Woche, in der wir Snowball gefunden hatten. Dicke, langsame Flocken trieben über den Anger, über die Kapelle, die Buden und die zugewandten Gesichter. Die ganze Stadt hielt mit einem Mal inne, blickte nach oben und wurde still.</w:t>
       </w:r>
     </w:p>
     <w:p>
@@ -3558,7 +3558,7 @@
     </w:p>
     <w:p>
       <w:r>
-        <w:t>Sie fragte nicht, was ich mit dem Morgen meinte. Ich glaube, bis dahin hatte sie es bereits geahnt. Wir standen noch eine Weile im Schnee, wir drei und der Pinguin inmitten der ganzen hellen Stadt, und ließen den Tag das sein, was er war.</w:t>
+        <w:t xml:space="preserve">Sie fragte nicht, was ich mit dem Morgen meinte. Ich glaube, bis dahin hatte sie bereits zu ahnen begonnen. Wir standen noch eine Weile im Schnee, wir drei und der Pinguin inmitten der ganzen hellen Stadt, und ließen den Tag das sein, was er war.</w:t>
       </w:r>
     </w:p>
     <w:p>
@@ -3609,7 +3609,7 @@
     </w:p>
     <w:p>
       <w:r>
-        <w:t>Dann wischte ich mir das Gesicht ab und zwang mich, noch einmal das Ding zu betrachten, das in Fionas Wohnzimmer in mir hängengeblieben war. Theo hatte die Zettel geschrieben. Aber Theo konnte den zweiten unmöglich in eine Lobby voller Festivalgäste getragen und sich entfernt haben, ohne dass auch nur eine Seele Notiz davon genommen hätte. Jemand anderes hatte ihn zum Gasthof gebracht.</w:t>
+        <w:t xml:space="preserve">Dann wischte ich mir das Gesicht ab und zwang mich, noch einmal das Ding zu betrachten, das in Fionas Wohnzimmer in mir hängengeblieben war. Theo hatte die Zettel geschrieben. Aber Theo konnte den zweiten unmöglich in eine Lobby voller Festgäste getragen und sich entfernt haben, ohne dass auch nur eine Seele Notiz davon genommen hätte. Jemand anderes hatte ihn zum Gasthof gebracht.</w:t>
       </w:r>
     </w:p>
     <w:p>
@@ -3623,7 +3623,7 @@
         <w:t xml:space="preserve">Ich weiß, wie deine Familie zu diesem Gasthof gekommen ist</w:t>
       </w:r>
       <w:r>
-        <w:t>, hatte der erste Zettel gelautet. Der Diebstahl selbst, die Brosche, der Stein, das Pfandhaus in Ridgeline, stand all das in den Blackburn-Briefen, in Theos Archiv. Aber der Kauf des Gasthofs, der Erwerb von 1924, die Papierspur einer Immobilie, die den Besitzer wechselte, stand in keinem Blackburn-Brief. Das war ein Grundbucheintrag. Eine Urkunde.</w:t>
+        <w:t xml:space="preserve">, hatte der erste Zettel gelautet. Der Diebstahl selbst, die Brosche, der Stein, das Pfandhaus in Ridgeline – all das stand in den Blackburn-Briefen, in Theos Archiv. Aber der Kauf des Gasthofs, der Erwerb von 1924, die Papierspur einer Immobilie, die den Besitzer wechselte, stand in keinem Blackburn-Brief. Das war ein Grundbucheintrag. Eine Urkunde.</w:t>
       </w:r>
     </w:p>
     <w:p>
@@ -3705,13 +3705,13 @@
     <w:p/>
     <w:p>
       <w:r>
-        <w:t xml:space="preserve">Sie hatte diese hier gelesen. Sie hatte sie herausgeholt. Die Urkunde des Gasthofs, das Papier, das den Kauf von 1924 verzeichnete, die Hälfte des Geheimnisses, die in keinem Blackburn-Brief stand und es nie getan hatte. Sie war in Vera Reeds Händen gewesen, vor so kurzer Zeit, dass sie sie noch nicht weggeräumt hatte.</w:t>
-      </w:r>
-    </w:p>
-    <w:p/>
-    <w:p>
-      <w:r>
-        <w:t>Als sie mit einer Kopie der Anger-Urkunde zurückkam, dankte ich ihr und brachte mein langweiliges Komitee-Gespräch über Händler und Standorte vor. Dann ließ ich mir Zeit, sie in meine Tasche zu falten. Ich beobachtete sie, und nun da ich wusste, worauf ich achtete, konnte ich sie deutlich lesen. Sie war keine harte Frau. Das war es, was mich berührte. Ich hatte halb erwartet, als ich es endlich ganz vor mir sah, etwas Kaltes und Habgieriges unter der Müdigkeit zu finden. Da war überhaupt nichts Kaltes, nur zu Erschöpfung abgenutzte Angst, die knochentiefe Angst eines Menschen, der eine Sache getan hat, die viel zu groß für ihn ist, und jede Nacht schlaflos darin liegt. Ihre Hände waren nicht ruhig, als sie den Korb gerade rückte. Zwei vergessene Tassen Kaffee standen kalt auf dem Schreibtisch. Sie sah aus, wie Fiona die ganze Woche über ausgesehen hatte, wie ein Mensch, der ausgepresst wurde, nur dass sie es war, die das Auspressen besorgte, und irgendwie war das noch trauriger.</w:t>
+        <w:t xml:space="preserve">Sie hatte diese hier gelesen. Sie hatte sie herausgeholt. Die Urkunde des Gasthofs, das Papier, das den Kauf von 1924 verzeichnete, die Hälfte des Geheimnisses, die in keinem Blackburn-Brief stand und nie gestanden hatte. Sie war in Vera Reeds Händen gewesen, vor so kurzer Zeit, dass sie sie noch nicht weggeräumt hatte.</w:t>
+      </w:r>
+    </w:p>
+    <w:p/>
+    <w:p>
+      <w:r>
+        <w:t xml:space="preserve">Als sie mit einer Kopie der Anger-Urkunde zurückkam, dankte ich ihr und brachte mein langweiliges Komitee-Gespräch über Händler und Standorte vor. Dann ließ ich mir Zeit, sie in meine Tasche zu falten. Ich beobachtete sie, und nun, da ich wusste, worauf ich achtete, konnte ich sie deutlich lesen. Sie war keine harte Frau. Das war es, was mich berührte. Ich hatte halb erwartet, als ich es endlich ganz vor mir sah, etwas Kaltes und Habgieriges unter der Müdigkeit zu finden. Da war überhaupt nichts Kaltes, nur zu Erschöpfung abgenutzte Angst, die knochentiefe Angst eines Menschen, der eine Sache getan hat, die viel zu groß für ihn ist, und jede Nacht schlaflos darin liegt. Ihre Hände waren nicht ruhig, als sie den Korb gerade rückte. Zwei vergessene Tassen Kaffee standen kalt auf dem Schreibtisch. Sie sah aus, wie Fiona die ganze Woche über ausgesehen hatte, wie ein Mensch, der ausgepresst wurde, nur dass sie es war, die das Auspressen besorgte, und irgendwie war das noch trauriger.</w:t>
       </w:r>
     </w:p>
     <w:p/>
@@ -3741,7 +3741,7 @@
     <w:p/>
     <w:p>
       <w:r>
-        <w:t xml:space="preserve">Theo wusste vom Diebstahl. Er hatte ihn in den Blackburn-Briefen gefunden, die Brosche, den Stein, das Pfandhaus. Er hatte ihn mit sorgfältiger Hand katalogisiert – der Saphir in ihrem Herzen –, und dann hatte er diese Briefe aus den Akten gezogen und sie als vermisst gemeldet. Aber Theo, der unterging, von der ganzen Stadt beobachtet, nie zu Hause, hätte den Rest nicht tun können. Er hätte nicht bestätigen können, dass der Gasthof mit dem Geld gekauft worden war, denn dieser Beweis befand sich nicht in seinem Gebäude. Und er hätte die Zettel nicht quer durch die Stadt tragen und am helllichten Festtag auf einen vollen Schreibtisch legen können, denn Theo Hussein konnte sich nicht unbemerkt die Evergreen Avenue entlangwagen, und wenn sein Leben davon abhinge.</w:t>
+        <w:t xml:space="preserve">Theo wusste vom Diebstahl. Er hatte ihn in den Blackburn-Briefen gefunden, die Brosche, den Stein, das Pfandhaus. Er hatte ihn mit sorgfältiger Hand katalogisiert – der Saphir in ihrem Herzen –, und dann hatte er diese Briefe aus den Akten gezogen und sie als vermisst gemeldet. Aber Theo, der unterging, von der ganzen Stadt beobachtet, nie zu Hause, hätte den Rest nicht tun können. Er hätte nicht bestätigen können, dass der Gasthof mit dem Geld gekauft worden war, denn dieser Beweis befand sich nicht in seinem Gebäude. Und er hätte die Zettel nicht quer durch die Stadt tragen und am helllichten Festtag auf einen umlagerten Tresen legen können, denn Theo Hussein konnte sich nicht unbemerkt die Evergreen Avenue entlangwagen, und wenn sein Leben davon abhinge.</w:t>
       </w:r>
     </w:p>
     <w:p/>
@@ -3753,13 +3753,13 @@
     <w:p/>
     <w:p>
       <w:r>
-        <w:t>Sie hatten es gemeinsam getan. Theo für den Verein, den er Zentimeter für Zentimeter sterben sah. Vera für das Geld, das sie so offensichtlich brauchte, einen städtischen Lohn für die Arbeit einer Großstadt und Rechnungen, von denen sie mir fast gesagt hatte, sie könne sie nicht bezahlen. Oder zum Teil für ihn, aus einer Loyalität oder Mitleid, deren Grund ich nicht ergründen konnte. Ich brauchte ihre genauen Gründe nicht. Das Bild stand fest.</w:t>
-      </w:r>
-    </w:p>
-    <w:p/>
-    <w:p>
-      <w:r>
-        <w:t>Ich hatte sie beide. Nach all dem Bangen hätte sich das wie ein Sieg anfühlen müssen, und stattdessen fühlte es sich an, als stünde ich auf dem Gipfel eines langen Hügels, den hinunterzugehen ich keine Lust hatte. Unten warteten zwei Menschen, die ich gekannt und gemocht hatte, eine Freundin, die sie zwischen sich zerrieben hatten, und eine ganze, warme Stadt, die vielleicht etwas Hässliches über zwei ihrer eigenen Leute erfahren musste.</w:t>
+        <w:t xml:space="preserve">Sie hatten es gemeinsam getan. Theo für den Verein, den er Zentimeter für Zentimeter sterben sah. Vera für das Geld, das sie so offensichtlich brauchte, einen städtischen Lohn für die Arbeit einer Großstadt und Rechnungen, von denen sie mir fast gesagt hatte, sie könne sie nicht bezahlen. Oder zum Teil für ihn, aus einer Loyalität oder einem Mitleid, dessen Tiefe ich nicht ausloten konnte. Ich brauchte ihre genauen Gründe nicht. Das Bild stand fest.</w:t>
+      </w:r>
+    </w:p>
+    <w:p/>
+    <w:p>
+      <w:r>
+        <w:t xml:space="preserve">Ich hatte sie beide. Nach all dem Bangen hätte sich das wie ein Sieg anfühlen müssen, und stattdessen fühlte es sich an, als stünde ich auf dem Gipfel eines langen Hügels, den ich nicht hinabsteigen wollte. Unten warteten zwei Menschen, die ich gekannt und gemocht hatte, eine Freundin, die sie zwischen sich zerrieben hatten, und eine ganze, warme Stadt, die vielleicht etwas Hässliches über zwei ihrer eigenen Leute erfahren musste.</w:t>
       </w:r>
     </w:p>
     <w:p/>
@@ -3771,7 +3771,7 @@
     <w:p/>
     <w:p>
       <w:r>
-        <w:t>Ich hatte die Wahrheit gefunden. Nun kam der schwierigere Teil, der Teil, den mir keine Menge an Klugheit abnehmen konnte. Jetzt musste ich wählen, wie es ausging.</w:t>
+        <w:t xml:space="preserve">Ich hatte die Wahrheit gefunden. Nun kam der schwierigere Teil, der Teil, den mir keine noch so große Klugheit abnehmen konnte. Jetzt musste ich wählen, wie es ausging.</w:t>
       </w:r>
     </w:p>
     <w:p/>
@@ -3848,7 +3848,7 @@
     <w:p/>
     <w:p>
       <w:r>
-        <w:t xml:space="preserve">»Ich kann es nicht vergraben«, sagte ich. »Ich will es. Gott weiß, ich will heute Abend rübergehen, das alles wegflüstern und alle ihr Leben behalten lassen. Aber wenn ich das tue, hört Fiona nie auf, Angst zu haben, nicht wirklich. Theo muss nie zu einem Mann werden, dem man vergeben kann. Und die Fäulnis bleibt unten in der Wand, wo ich sie nicht sehen kann, und wächst.« Ich drückte die Handballen gegen meine Augen. »Das Gütige und das Einfache sind nicht dasselbe. Es muss ans Licht kommen. Alles davon. Richtig. Mit Noriko Tanaka. Mit dem Gesetz darin, sanft getan, mit Barmherzigkeit getan, aber getan. Das ist der einzige Weg, wie Fiona jemals frei davon wird, und der einzige Weg, wie Theo jemals etwas anderes sein kann als ein Mann mit einem Verbrechen unter seinen Dielen.«</w:t>
+        <w:t xml:space="preserve">»Ich kann es nicht vergraben«, sagte ich. »Ich will es. Gott weiß, ich will heute Abend rübergehen, das alles wegflüstern und alle ihr Leben behalten lassen. Aber wenn ich das tue, hört Fiona nie auf, Angst zu haben, nicht wirklich. Theo muss nie zu einem Mann werden, dem man vergeben kann. Und die Fäulnis bleibt unten in der Wand, wo ich sie nicht sehen kann, und wächst.« Ich drückte die Handballen gegen meine Augen. »Das Gütige und das Einfache sind nicht dasselbe. Es muss ans Licht kommen. Alles davon. Richtig. Mit Noriko Tanaka. Mit dem Gesetz, sanft getan, mit Barmherzigkeit getan, aber getan. Das ist der einzige Weg, wie Fiona jemals frei davon wird, und der einzige Weg, wie Theo jemals etwas anderes sein kann als ein Mann mit einem Verbrechen unter seinen Dielen.«</w:t>
       </w:r>
     </w:p>
     <w:p/>
@@ -3866,19 +3866,19 @@
     <w:p/>
     <w:p>
       <w:r>
-        <w:t>Ich saß mit dieser Angst da und ließ sie real sein. Dann ließ ich sie los, denn Martha hatte sie im Kreis bereits beantwortet, mit ihrer Hand auf meinem Knie. Was immer du mit dir herumträgst, du musst es nicht ganz allein tragen. Genau das ist der Sinn eines Kreises. Ich konnte einen Ort genug lieben, um das schwere, richtige Ding für ihn zu tun, und darauf vertrauen, dass er auf der anderen Seite immer noch meiner sein würde.</w:t>
-      </w:r>
-    </w:p>
-    <w:p/>
-    <w:p>
-      <w:r>
-        <w:t>Ich würde mir Frost Falls nicht dadurch verdienen, dass ich es vor sich selbst beschützte. Mark Redferns Trauer hatte begonnen zu heilen, als man sich ihr laut stellte, während die ganze Stadt erschien, und das hier musste genauso gemacht werden.</w:t>
-      </w:r>
-    </w:p>
-    <w:p/>
-    <w:p>
-      <w:r>
-        <w:t>»Ich bin mir sicher«, sagte ich. »Licht, nicht Dunkelheit. Aber sanft, Nick. Mit so viel Barmherzigkeit, wie die Wahrheit fassen kann. Das Verbrechen kommt ans Tageslicht, wo jeder es sehen kann, aber niemand wird vernichtet, der es nicht muss. Es gibt eine Art, Gerechtigkeit zu üben, die trotzdem warm ist. Die muss es geben. Ich gedenke, sie zu finden.«</w:t>
+        <w:t xml:space="preserve">Ich saß mit dieser Angst da und ließ sie real sein. Dann ließ ich sie los, denn Martha hatte sie beim Strickkreis bereits beantwortet, mit ihrer Hand auf meinem Knie. Was immer du mit dir herumträgst, du musst es nicht ganz allein tragen. Genau das ist der Sinn eines Kreises. Ich konnte einen Ort genug lieben, um das Richtige und Schwere für ihn zu tun, und darauf vertrauen, dass er auf der anderen Seite immer noch meiner sein würde.</w:t>
+      </w:r>
+    </w:p>
+    <w:p/>
+    <w:p>
+      <w:r>
+        <w:t xml:space="preserve">Ich würde mir Frost Falls nicht dadurch verdienen, dass ich es vor sich selbst beschützte. Mark Redferns Trauer hatte begonnen zu heilen, als man sich ihr laut stellte und die ganze Stadt zur Stelle war, und das hier musste genauso gemacht werden.</w:t>
+      </w:r>
+    </w:p>
+    <w:p/>
+    <w:p>
+      <w:r>
+        <w:t xml:space="preserve">»Ich bin mir sicher«, sagte ich. »Licht, nicht Dunkelheit. Aber sanft, Nick. Mit so viel Barmherzigkeit, wie die Wahrheit fassen kann. Das Verbrechen kommt ans Tageslicht, wo jeder es sehen kann, aber niemand wird vernichtet, der es nicht werden muss. Es gibt eine Art, Gerechtigkeit zu üben, die trotzdem warm ist. Die muss es geben. Ich gedenke, sie zu finden.«</w:t>
       </w:r>
     </w:p>
     <w:p/>
@@ -3905,7 +3905,7 @@
     </w:p>
     <w:p>
       <w:r>
-        <w:t xml:space="preserve">Polizeichefin Tanaka hörte sich die Sache in ihrem kleinen Büro auf der Wache an; ihr abgenutztes Notizbuch lag aufgeschlagen auf dem Schreibtisch vor ihr und ihr Füller ruhte still darauf. Sie schrieb nicht mit, während sie abwägte, ob sie einem glauben sollte. Ich breitete alles vor ihr aus, so wie ich es mir am Küchentisch zurechtgelegt hatte. Die beiden Zettel. Theos Karteikarte mit den fünf übereinstimmenden Wörtern. Das Briefpapier des Vereins, Maserung für Maserung unter der Lampe verglichen. Die Urkunde des Gasthofs, die in Veras Ablagekorb außerhalb ihrer Schublade lag. Constance, die Brosche, das Pfandhaus in Ridgeline, die ganze hundertjährige Wurzel der Sache und Neils Mappe darunter, jener Teil, der aus der Wurzel eine menschliche machte.</w:t>
+        <w:t xml:space="preserve">Polizeichefin Tanaka hörte sich die Sache in ihrem kleinen Büro auf der Wache an; ihr abgenutztes Notizbuch lag aufgeschlagen auf dem Schreibtisch vor ihr und ihr Füller ruhte still darauf. Sie schrieb nicht mit, während sie abwägte, ob sie einem glauben sollte. Ich breitete alles vor ihr aus, so wie ich es mir am Küchentisch zurechtgelegt hatte. Die beiden Zettel. Theos Karteikarte mit den fünf übereinstimmenden Wörtern. Das Briefpapier des Vereins, Maserung für Maserung unter der Lampe verglichen. Die Urkunde des Gasthofs, die in Veras Ablagekorb außerhalb ihrer Schublade lag. Constance, die Brosche, das Pfandhaus in Ridgeline, die ganze hundertjährige Wurzel der Sache und Neils Ordner darunter, jener Teil, der aus der Wurzel eine menschliche machte.</w:t>
       </w:r>
     </w:p>
     <w:p>
@@ -3930,7 +3930,7 @@
     </w:p>
     <w:p>
       <w:r>
-        <w:t xml:space="preserve">»Es gibt einen Weg«, sagte sie. »Es gibt fast immer einen Weg, wenn die beteiligten Personen keine Monster sind, und nach allem, was du mir erzählt hast, sind diese beiden keine Monster. Sie sind ein verzweifelter Mann und eine verängstigte Frau, die etwas Schlimmes getan haben aus Gründen, von denen sie sich zu mehr als der Hälfte eingeredet hatten, sie seien gut.« Sie legte den Füller weg. »Hier ist, was ich nicht tun werde. Ich werde keine Tür eintreten und Theo Hussein mitten im Fest vor der ganzen Stadt in Handschellen abführen. Das hilft niemandem, es ist nicht notwendig, und ich tue nichts so Grausames, wenn etwas Freundlicheres funktioniert.« Sie sah mich ruhig über den Schreibtisch hinweg an. »Hier ist, was ich tun werde. Ich gebe ihm die Gelegenheit, dazu zu stehen, mit mir im Raum, sodass es rechtlich geregelt und dokumentiert ist. Wenn er freiwillig dazu steht und es wiedergutmacht, mit Wiedergutmachung und einer echten Rechenschaft, dann gibt es Raum dafür, dass dies in etwas anderem als dem Ruin endet. Wir nennen das restaurative Gerechtigkeit. Sie repariert, was möglich ist, anstatt nur zu zerbrechen, was übrig geblieben ist. Aber das funktioniert nur, wenn es wahr ist, Jessica. Wenn er lügt oder versucht, sich durch die Hintertür herauszureden, dann geht es den harten Weg, und das ist seine Entscheidung, nicht meine und nicht deine.«</w:t>
+        <w:t xml:space="preserve">»Es gibt einen Weg«, sagte sie. »Es gibt fast immer einen Weg, wenn die beteiligten Personen keine Monster sind, und nach allem, was du mir erzählt hast, sind diese beiden keine Monster. Sie sind ein verzweifelter Mann und eine verängstigte Frau, die etwas Schlimmes getan haben aus Gründen, von denen sie sich zu mehr als der Hälfte eingeredet hatten, sie seien gut.« Sie legte den Füller weg. »Hier ist, was ich nicht tun werde. Ich werde keine Tür eintreten und Theo Hussein mitten im Fest vor der ganzen Stadt in Handschellen abführen. Das hilft niemandem, es ist nicht notwendig, und ich tue nichts so Grausames, wenn etwas Freundlicheres funktioniert.« Sie sah mich ruhig über den Schreibtisch hinweg an. »Hier ist, was ich tun werde. Ich gebe ihm die Gelegenheit, dazu zu stehen, mit mir im Raum, sodass es rechtlich geregelt und dokumentiert ist. Wenn er freiwillig dazu steht und es wiedergutmacht, mit Entschädigung und einer echten Rechenschaft, dann gibt es Raum dafür, dass dies in etwas anderem als dem Ruin endet. Wir nennen das restaurative Gerechtigkeit. Sie repariert, was möglich ist, anstatt nur zu zerbrechen, was übrig geblieben ist. Aber das funktioniert nur, wenn es wahr ist, Jessica. Wenn er lügt oder versucht, sich durch die Hintertür herauszureden, dann geht es den harten Weg, und das ist seine Entscheidung, nicht meine und nicht deine.«</w:t>
       </w:r>
     </w:p>
     <w:p>
@@ -3955,7 +3955,7 @@
     </w:p>
     <w:p>
       <w:r>
-        <w:t>Ich erzählte ihr alles. Wer und wie, und dass es die beiden zusammen waren. Ich sah zu, wie es bei ihr ankam, der Schmerz darüber, dass es Theo war, dass es Vera war, Menschen, mit denen sie an ihren Tischen gegessen und gelacht hatte. Und dann gab ich ihr Neils Mappe und erzählte ihr das andere, die Sache, die das ganze Bild veränderte.</w:t>
+        <w:t xml:space="preserve">Ich erzählte ihr alles. Wer und wie, und dass es die beiden zusammen waren. Ich sah zu, wie es bei ihr ankam, der Schmerz darüber, dass es Theo war, dass es Vera war, Menschen, mit denen sie an ihren Tischen gegessen und gelacht hatte. Und dann gab ich ihr Neils Ordner und erzählte ihr das andere, die Sache, die das ganze Bild veränderte.</w:t>
       </w:r>
     </w:p>
     <w:p>
@@ -3970,7 +3970,7 @@
     </w:p>
     <w:p>
       <w:r>
-        <w:t>»Ich hatte solche Angst«, sagte sie. »Jahre und Jahre. Vor einer Sache, die, wenn man sie ganz erzählt, nicht einmal… sie war ein Mädchen, das versuchte, ihre Mutter zu retten. Das war alles, was sie war. Ein Mädchen, das versuchte, ihre Mutter zu retten.«</w:t>
+        <w:t xml:space="preserve">»Ich hatte solche Angst«, sagte sie. »Jahre und Jahre. Vor einer Sache, die, wenn man sie ganz erzählt, nicht einmal … sie war ein Mädchen, das versuchte, ihre Mutter zu retten. Das war alles, was sie war. Ein Mädchen, das versuchte, ihre Mutter zu retten.«</w:t>
       </w:r>
     </w:p>
     <w:p>
@@ -4068,7 +4068,7 @@
     <w:p/>
     <w:p>
       <w:r>
-        <w:t xml:space="preserve">»Ich redete mir ein, es sei eigentlich kein Diebstahl«, sagte er. »Nicht an Fiona. Ich redete mir ein, der Gasthof sei sowieso mit gestohlenem Geld gekauft worden, also sei es kein Raub, sich ein wenig davon zurückzuholen, sondern, ich weiß nicht, Geschichte, die sich selbst korrigiert, eine Schuld, die endlich fällig wird. Ich bin so gut darin, der Vergangenheit die Bedeutung zu geben, die ich gerade brauche. Das ist meine ganze Ausbildung, die Vergangenheit verständlich zu machen.« Er drückte seine Fäuste wie ein Kind gegen die Augen. »Das Dach bricht ein. Die Heizung geht kaputt. Hundert Jahre Erinnerung dieser Stadt, jeder Brief und jedes Foto und jede Urkunde, alles verkommt, und jede ehrliche Tür, an die ich klopfte, wurde mir vor der Nase zugeschlagen, der Bürgermeister, die Fördermittel, die Stiftungen, jede einzelne. Und dann fand ich diese Briefe, und da war es, eine halbe Million Dollar, einfach so in der Vergangenheit liegend, und ich dachte, ich kann es retten. Ich kann das alles retten, jeden Schnipsel, und niemand kommt wirklich zu Schaden, weil das Geld von vornherein schmutzig war.« Er blickte auf, elend. »Und dann sah ich, was es mit ihr machte. Mit Fiona. Ich sah zu, wie sie grau wurde. Und ich sagte mir, ich würde aufhören, und ich hörte nicht auf, weil ich da schon so tief drinsteckte, und als ich es einmal getan hatte, sagte ich mir, auf einen weiteren käme es auch nicht mehr an.« Er wandte sich Fiona zu, und seine Stimme brach. »Es tut mir so leid. Es tut mir so leid, Fiona. Ich habe mich irgendwo darin verloren. Ich liebe die Geschichte dieser Stadt so sehr, dass ich vergaß, dass die Stadt aus lebendigen Menschen besteht.«</w:t>
+        <w:t xml:space="preserve">»Ich redete mir ein, es sei eigentlich kein Diebstahl«, sagte er. »Nicht an Fiona. Ich redete mir ein, der Gasthof sei sowieso mit gestohlenem Geld gekauft worden, also sei es kein Raub, sich ein wenig davon zurückzuholen, sondern, ich weiß nicht, Geschichte, die sich selbst korrigiert, eine Schuld, die endlich fällig wird. Ich bin so gut darin, der Vergangenheit die Bedeutung zu geben, die ich gerade brauche. Das ist meine ganze Ausbildung, die Vergangenheit verständlich zu machen.« Er drückte seine Fäuste wie ein Kind gegen die Augen. »Das Dach bricht ein. Der Heizkessel macht es nicht mehr lange. Hundert Jahre Erinnerung dieser Stadt, jeder Brief und jedes Foto und jede Urkunde, alles verkommt, und jede ehrliche Tür, an die ich klopfte, wurde mir vor der Nase zugeschlagen, der Bürgermeister, die Fördermittel, die Stiftungen, jede einzelne. Und dann fand ich diese Briefe, und da war es, eine halbe Million Dollar, einfach so in der Vergangenheit liegend, und ich dachte, ich kann es retten. Ich kann das alles retten, jeden Schnipsel, und niemand kommt wirklich zu Schaden, weil das Geld von vornherein schmutzig war.« Er blickte auf, elend. »Und dann sah ich, was es mit ihr machte. Mit Fiona. Ich sah zu, wie sie grau wurde. Und ich sagte mir, ich würde aufhören, und ich hörte nicht auf, weil ich da schon so tief drinsteckte, und als ich es einmal getan hatte, sagte ich mir, auf einen weiteren käme es auch nicht mehr an.« Er wandte sich Fiona zu, und seine Stimme brach. »Es tut mir so leid. Es tut mir so leid, Fiona. Ich habe mich irgendwo darin verloren. Ich liebe die Geschichte dieser Stadt so sehr, dass ich vergaß, dass die Stadt aus lebendigen Menschen besteht.«</w:t>
       </w:r>
     </w:p>
     <w:p/>
@@ -4086,7 +4086,7 @@
     <w:p/>
     <w:p>
       <w:r>
-        <w:t xml:space="preserve">»Vera«, sagte ich. »Theo wusste vom Diebstahl. Aber in den Zetteln stand, dass der Gasthof mit dem Geld der Brosche gekauft worden war, und das stand in keinem Blackburn-Brief. Das ist ein Grundbucheintrag. Eine Urkunde. Und die Urkunde für diesen Gasthof lag gestern Morgen außerhalb ihrer Schublade in Ihrem Ablagekorb, kürzlich angefasst auf dem Schreibtisch einer Frau, die mir zweimal versichert hatte, sie lese nie in den Akten hinter ihrem Rücken.« Ich hielt meine Stimme leise. »Er wusste vom Diebstahl. Sie hatten die Urkunde. Und Sie hatten die Beine, Vera. Er hätte dieses Stadtgebiet nicht unbemerkt durchqueren können, jeder kennt Theo, jeder hält ihn auf. Aber niemand zuckt mit der Wimper, wenn die Sekretärin des Bürgermeisters während des Festes kurz im Gasthof vorbeischaut. Ich bin Ihnen an jenem Morgen selbst auf der Treppe begegnet, mit Ihren Parkausweisen. Er hätte das unmöglich allein tun können. Er brauchte jemanden, der sich ungesehen durch die Stadt bewegen konnte. Das waren Sie.«</w:t>
+        <w:t xml:space="preserve">»Vera«, sagte ich. »Theo wusste vom Diebstahl. Aber in den Zetteln stand, dass der Gasthof mit dem Geld der Brosche gekauft worden war, und das stand in keinem Blackburn-Brief. Das ist ein Grundbucheintrag. Eine Urkunde. Und die Urkunde für diesen Gasthof lag gestern Morgen außerhalb ihrer Schublade in Ihrem Ablagekorb, kürzlich angefasst auf dem Schreibtisch einer Frau, die mir zweimal versichert hatte, sie lese nie in den Akten hinter ihrem Rücken.« Ich hielt meine Stimme leise. »Er wusste vom Diebstahl. Sie hatten die Urkunde. Und Sie hatten die Beine, Vera. Er hätte diese Stadt nicht unbemerkt durchqueren können, und wenn sein Leben davon abgehangen hätte, jeder kennt Theo, jeder hält ihn auf. Aber niemand zuckt mit der Wimper, wenn die Sekretärin des Bürgermeisters während des Festes kurz im Gasthof vorbeischaut. Ich bin Ihnen an jenem Morgen selbst auf der Treppe begegnet, mit Ihren Parkscheinen. Er hätte das unmöglich allein tun können. Er brauchte jemanden, der sich ungesehen durch die Stadt bewegen konnte. Das waren Sie.«</w:t>
       </w:r>
     </w:p>
     <w:p/>
@@ -4098,7 +4098,7 @@
     <w:p/>
     <w:p>
       <w:r>
-        <w:t xml:space="preserve">»Er kam zu mir«, sagte sie. »Vor Wochen. Völlig von Sinnen, erzählte von dem Verein, davon, dass er dieses Ding gefunden hatte und es nicht allein schaffen konnte. Und ich hätte Nein sagen müssen. Ich weiß, dass ich Nein hätte sagen müssen, ich wusste es damals schon.« Sie wiegte sich ein wenig hin und her, die Arme fest um sich geschlungen. »Aber ich bin so im Rückstand, Mrs. Claus. Der Bürgermeister bezahlt mich miserabel und treibt mich bis zur Erschöpfung an, und ich habe Schulden, dass Sie es nicht glauben würden, solche, bei denen man nicht schlafen kann, und Theo sagte, das sei Geld, das vor hundert Jahren von einer reichen Familie gestohlen worden war, und dass es den Verein retten würde und ein Stück davon an mich abfallen und ich endlich aus dem Schneider sein würde. Er klang fast edel dabei. Darin ist er gut, eine Sache wie Geschichte klingen zu lassen statt wie ein Verbrechen. Und ich wollte so unbedingt aus dem Schneider sein, dass ich zuließ, dass es sich so anhörte, weil ich es glauben wollte.« Sie blickte Fiona an, tief getroffen. »Ich habe nie an dich als Menschen gedacht. Das ist das Schlimmste daran, das ist das, was ich mit mir herumtragen werde. Ich dachte nur an das Geld und das Nichtschlafen. Es tut mir leid. Es tut mir so unglaublich leid, Fiona.«</w:t>
+        <w:t xml:space="preserve">»Er kam zu mir«, sagte sie. »Vor Wochen. Halb von Sinnen, erzählte von dem Verein, davon, dass er dieses Ding gefunden hatte und es nicht allein schaffen konnte. Und ich hätte Nein sagen müssen. Ich weiß, dass ich Nein hätte sagen müssen, ich wusste es damals schon.« Sie wiegte sich ein wenig hin und her, die Arme fest um sich geschlungen. »Aber ich bin so im Rückstand, Mrs. Claus. Der Bürgermeister bezahlt mich miserabel und treibt mich bis zur Erschöpfung an, und ich habe Schulden, dass Sie es nicht glauben würden, solche, bei denen man nicht schlafen kann, und Theo sagte, das sei Geld, das vor hundert Jahren von einer reichen Familie gestohlen worden war, und dass es den Verein retten würde und ein Stück davon an mich abfallen und ich endlich aus dem Schneider sein würde. Er klang fast edel dabei. Darin ist er gut, eine Sache wie Geschichte klingen zu lassen statt wie ein Verbrechen. Und ich wollte so unbedingt aus dem Schneider sein, dass ich zuließ, dass es sich so anhörte, weil ich es glauben wollte.« Sie blickte Fiona an, tief getroffen. »Ich habe nie an dich als Menschen gedacht. Das ist das Schlimmste daran, das ist das, was ich mit mir herumtragen werde. Ich dachte nur an das Geld und das Nichtschlafen. Es tut mir leid. Es tut mir so unglaublich leid, Fiona.«</w:t>
       </w:r>
     </w:p>
     <w:p/>
@@ -4139,7 +4139,7 @@
     <w:p/>
     <w:p>
       <w:r>
-        <w:t>Beide hatten es sofort freiwillig eingestanden, sobald man sie darauf angesprochen hatte, keiner von beiden hatte eine Vorgeschichte von Verfehlungen, und die Frau, an der sie sich versündigt hatten, bat um Wiedergutmachung statt um Ruin. Also baute Noriko ihnen einen Weg, der weder eine Gefängniszelle noch ein Freispruch war.</w:t>
+        <w:t xml:space="preserve">Beide hatten es sofort freiwillig eingestanden, sobald man sie darauf angesprochen hatte, keiner von beiden hatte eine Vorgeschichte von Verfehlungen, und die Frau, der sie Unrecht getan hatten, bat um Wiedergutmachung statt um Ruin. Also baute Noriko ihnen einen Weg, der weder eine Gefängniszelle noch ein Freispruch war.</w:t>
       </w:r>
     </w:p>
     <w:p/>
@@ -4223,13 +4223,13 @@
     <w:p/>
     <w:p>
       <w:r>
-        <w:t xml:space="preserve">Das hätte das Ende sein müssen. Doch da war nach wie vor die Sache mit dem Verein selbst, genau jenem Ort, für dessen Rettung Theo sich selbst ruiniert hatte. Er war nun weg von dort. Das Dach ließ nach wie vor Regen durch, und die Heizung gab weiterhin den Geist auf, und nichts in der ganzen Abrechnung hatte auch nur einen einzigen Dollar zu dem einen oder dem anderen beigesteuert.</w:t>
-      </w:r>
-    </w:p>
-    <w:p/>
-    <w:p>
-      <w:r>
-        <w:t>Die Sache, die er durch Unrecht zu retten versucht hatte, scheiterte nach wie vor. Und nun, da er fort war, musste sie auf die richtige Weise gerettet werden, von der Stadt, für sie selbst. Oder sie würde überhaupt nicht gerettet werden.</w:t>
+        <w:t xml:space="preserve">Das hätte das Ende sein müssen. Doch da war nach wie vor die Sache mit dem Verein selbst, genau jenem Ort, für dessen Rettung Theo sich selbst ruiniert hatte. Er war nun weg von dort. Das Dach ließ nach wie vor Regen durch, und der Heizkessel lag weiterhin in den letzten Zügen, und nichts in der ganzen Abrechnung hatte auch nur einen einzigen Dollar zu dem einen oder dem anderen beigesteuert.</w:t>
+      </w:r>
+    </w:p>
+    <w:p/>
+    <w:p>
+      <w:r>
+        <w:t xml:space="preserve">Die Sache, die er durch Unrecht zu retten versucht hatte, scheiterte nach wie vor. Und nun, da er fort war, musste sie auf die richtige Weise gerettet werden, von der Stadt und für die Stadt selbst. Oder sie würde überhaupt nicht gerettet werden.</w:t>
       </w:r>
     </w:p>
     <w:p>
@@ -4245,12 +4245,12 @@
     </w:p>
     <w:p>
       <w:r>
-        <w:t>Sie hatten es natürlich erfahren. In Frost Falls sprach sich so etwas im Handumdrehen herum. Die distinguierten, freundlichen Worthingtons hatten sich aus dem Gemurmel des Festes und dem gedämpften Treiben des Gasthofs zusammengereimt, dass der Historische Verein in tiefen Schwierigkeiten steckte und dass diese Schwierigkeiten einen anständigen Menschen auf Abwege gebracht hatten. Mr. Worthington traf mich an ihrem letzten Vormittag auf der Veranda des Gasthofs an, seine Frau im kaschmirbeigen Kostüm an seiner Seite und den guten Mantel über den Arm gelegt, und er kam mit der Gelassenheit eines Mannes auf den Punkt, für den Geld nie ein schwieriges Thema gewesen war.</w:t>
-      </w:r>
-    </w:p>
-    <w:p>
-      <w:r>
-        <w:t xml:space="preserve">»Mrs. Claus«, sagte er. »Wir haben diese Stadt in den Wochen hier ins Herz geschlossen. Aufrichtig ins Herz geschlossen. Und wir haben gehört, dass der Historische Verein in argen finanziellen Nöten ist. Ernsthaften Nöten, wie man uns zugetragen hat.« Er lächelte, warm und zuversichtlich. »Wir sind in der Lage zu helfen. Großzügig. Genug, um die ganze Sache mit einem Schlag zu regeln – das Dach, die Heizung und obendrein eine Stiftung, damit der Ort für eine Generation sicher ist. Ich würde den Scheck heute Vormittag vor unserer Abreise gern noch ausstellen. Uns würde das fast nichts kosten, aber hier würde es eine Menge bedeuten, und ehrlich gesagt, nach all dem Unschönen, finde ich, dass die Stadt zum Ausklang der Saison ein paar gute Nachrichten gebrauchen könnte.«</w:t>
+        <w:t xml:space="preserve">Sie hatten es natürlich erfahren. In Frost Falls sprach sich so etwas im Handumdrehen herum. Die distinguierten, freundlichen Worthingtons hatten sich aus dem Gemurmel des Festes und dem gedämpften Treiben des Gasthofs zusammengereimt, dass der Historische Verein in tiefen Schwierigkeiten steckte und dass diese Schwierigkeiten einen anständigen Menschen auf Abwege gebracht hatten. Mr. Worthington traf mich an ihrem letzten Vormittag auf der Veranda des Gasthofs an, seine Frau in ihrem cremefarbenen Kaschmir an seiner Seite und den guten Mantel über den Arm gelegt, und er kam mit der Gelassenheit eines Mannes auf den Punkt, für den Geld nie ein schwieriges Thema gewesen war.</w:t>
+      </w:r>
+    </w:p>
+    <w:p>
+      <w:r>
+        <w:t xml:space="preserve">»Mrs. Claus«, sagte er. »Wir haben diese Stadt in den Wochen hier ins Herz geschlossen. Aufrichtig ins Herz geschlossen. Und wir haben gehört, dass der Historische Verein in argen finanziellen Nöten ist. Ernsthaften Nöten, wie man uns zugetragen hat.« Er lächelte, warm und zuversichtlich. »Wir sind in der Lage zu helfen. Großzügig. Genug, um die ganze Sache mit einem Schlag zu regeln – das Dach, der Heizkessel und obendrein ein Stiftungskapital, damit der Ort für eine Generation sicher ist. Ich würde den Scheck heute Vormittag vor unserer Abreise gern noch ausstellen. Uns würde das fast nichts kosten, aber hier würde es eine Menge bedeuten, und ehrlich gesagt, nach all dem Unschönen, finde ich, dass die Stadt zum Ausklang der Saison ein paar gute Nachrichten gebrauchen könnte.«</w:t>
       </w:r>
     </w:p>
     <w:p>
@@ -4300,7 +4300,7 @@
     </w:p>
     <w:p>
       <w:r>
-        <w:t>So beließen sie es dabei. Kein Scheck. Stattdessen ein Versprechen, für den Notfall aufgespart. Und der Verein blieb genau da, wo er gewesen war – am Abgrund, mit undichtem Dach und versagender Heizung, nur dass jetzt nicht einmal mehr Theo da war, der für ihn kämpfte, was die Lage eher noch prekärer machte, statt sie zu verbessern.</w:t>
+        <w:t xml:space="preserve">So beließen sie es dabei. Kein Scheck. Stattdessen ein Versprechen, für den Notfall aufgespart. Und der Verein blieb genau da, wo er gewesen war – am Abgrund, mit undichtem Dach und versagendem Heizkessel, nur dass jetzt nicht einmal mehr Theo da war, der für ihn kämpfte, was die Lage eher noch prekärer machte, statt sie zu verbessern.</w:t>
       </w:r>
     </w:p>
     <w:p>
@@ -4366,7 +4366,7 @@
     </w:p>
     <w:p>
       <w:r>
-        <w:t>Martha sagte das Wahre dazu, beim Strickkreis, während ihre Nadeln unermüdlich klapperten und ihr Blick auf ihrer Arbeit ruhte.</w:t>
+        <w:t xml:space="preserve">Martha sagte das Treffendste dazu, beim Strickkreis, während ihre Nadeln unermüdlich klapperten und ihr Blick auf ihrer Arbeit ruhte.</w:t>
       </w:r>
     </w:p>
     <w:p>
@@ -4386,12 +4386,12 @@
     </w:p>
     <w:p>
       <w:r>
-        <w:t>Ich hatte mich darauf eingestellt, zur Außenseiterin zu werden, die einen guten Mann ins Unglück gestürzt hatte. Mehr als zur Hälfte hatte ich erwartet, dass das Städtchen sich von mir abwenden, dass es sich wünschen würde, ich hätte die Finger davon gelassen, dass es sich bei jedem Anblick meiner Person daran erinnern würde, dass ich diejenige war, die Theo Hussein ans Licht gezerrt und den Frieden des Ortes gestört hatte. Und ein wenig davon gab es tatsächlich, hier und da, für eine Weile. Ein paar Leute, die meinen Blick nicht ganz ertragen konnten, die ein wenig verstummten, wenn ich einen Laden betrat. Ich verstand es und ließ es gut sein. Ich bohrte nicht nach.</w:t>
-      </w:r>
-    </w:p>
-    <w:p>
-      <w:r>
-        <w:t xml:space="preserve">Aber meistens geschah das Gegenteil. Die Leute fingen an, leise, von der Seite, so wie dieses Städtchen seine tiefsten Dinge tat, zu kommen und sich bei mir zu bedanken. Dot drückte mir auf dem Markt ein Glas ihrer eingemachten Früchte in die Hand und sagte brummig, während sie auf die Äpfel blickte und nicht auf mich: »Du hast dich Fiona gegenüber richtig verhalten. Die meisten hätten weggeschaut.« Sam Patel zog quer über die Evergreen Avenue hinweg respektvoll den Hut vor mir. Sogar Noriko, die mit Lob sparsam umging, sagte mir bei einer Tasse Kaffee, ich hätte die Sache besser gehandhabt als die meisten professionellen Leute, mit denen sie in ihrer Laufbahn zusammengearbeitet hatte, und ich hätte einen warmen Weg durch etwas gefunden, das fast immer nur kalte Wege kenne.</w:t>
+        <w:t xml:space="preserve">Ich hatte mich darauf eingestellt, zur Außenseiterin zu werden, die einen guten Mann ins Unglück gestürzt hatte. Mehr als zur Hälfte hatte ich erwartet, dass das Städtchen sich von mir abwenden, dass es sich wünschen würde, ich hätte die Finger davon gelassen, dass es sich bei jedem Anblick meiner Person daran erinnern würde, dass ich diejenige war, die Theo Hussein ans Licht gezerrt und dem Ort Kummer bereitet hatte. Und ein wenig davon gab es tatsächlich, hier und da, für eine Weile. Ein paar Leute, die meinen Blick nicht ganz ertragen konnten, die ein wenig verstummten, wenn ich einen Laden betrat. Ich verstand es und ließ es gut sein. Ich bohrte nicht nach.</w:t>
+      </w:r>
+    </w:p>
+    <w:p>
+      <w:r>
+        <w:t xml:space="preserve">Aber meistens geschah das Gegenteil. Die Leute fingen an, leise, von der Seite, so wie dieses Städtchen seine tiefsten Dinge tat, zu kommen und sich bei mir zu bedanken. Dot drückte mir auf dem Markt ein Glas ihrer eingemachten Früchte in die Hand und sagte brummig, während sie auf die Äpfel blickte und nicht auf mich: »Du hast dich Fiona gegenüber richtig verhalten. Die meisten hätten weggeschaut.« Sam Patel zog quer über die Evergreen Avenue hinweg respektvoll die Mütze vor mir. Sogar Noriko, die mit Lob sparsam umging, sagte mir bei einer Tasse Kaffee, ich hätte die Sache besser gehandhabt als die meisten professionellen Leute, mit denen sie in ihrer Laufbahn zusammengearbeitet hatte, und ich hätte einen warmen Weg durch etwas gefunden, das fast immer nur kalte Wege kenne.</w:t>
       </w:r>
     </w:p>
     <w:p>
@@ -4406,7 +4406,7 @@
     </w:p>
     <w:p>
       <w:r>
-        <w:t>Ich ging an diesem Nachmittag durch ein Städtchen nach Hause, das sich ganz und unzweifelhaft als das meine anfühlte. Das Fest war abgebaut und vorbei, aber die Lichter entlang der Evergreen Avenue, von denen inzwischen fast alle golden leuchteten, brannten noch immer stetig gegen die frühe Dunkelheit. Pip watschelte vor mir her von einem Lichtkreis zum nächsten, und blieb in jedem einzelnen stehen, als könnte er am Boden etwas Glänzendes verbergen.</w:t>
+        <w:t xml:space="preserve">Ich ging an diesem Nachmittag durch ein Städtchen nach Hause, das sich ganz und unzweifelhaft als das meine anfühlte. Das Fest war abgebaut und vorbei, aber die Lichter entlang der Evergreen Avenue, von denen inzwischen fast alle golden leuchteten, brannten noch immer stetig gegen die frühe Dunkelheit. Pip watschelte vor mir her von einem Lichtkreis zum nächsten und blieb in jedem einzelnen stehen, als könnte er am Boden etwas Glänzendes verbergen.</w:t>
       </w:r>
     </w:p>
     <w:p>
@@ -4453,7 +4453,7 @@
     </w:p>
     <w:p>
       <w:r>
-        <w:t xml:space="preserve">Sam Patel übernahm das Graben, weil Sam die schwere, ehrliche Arbeit verrichtete und sie mochte. Wir standen alle im goldenen Licht der Laternen und der Lichterketten im Kreis um ihn herum, und unser Atem stieg in der Kälte gemeinsam auf. Emma Redfern hielt meine Hand auf der einen Seite, und Pip lehnte sich warm an meinen Stiefel auf der anderen. Snowball trug seinen Geweihhut. Mark stand hinter seiner Tochter und hatte die Hände auf ihren Schultern. Der ganze Kreis war anwesend, und auch Neil Carter, der länger geblieben war, als er geplant hatte, und hinten stand, wobei sein Notizbuch diesmal in seiner Tasche verstaut war. Als Sams Schaufel auf etwas stieß, das dumpf, massiv und metallisch klang, gab der gesamte Anger gleichzeitig einen Laut von sich, ein leises, erstauntes Oh, das in der kalten Luft hängen blieb.</w:t>
+        <w:t xml:space="preserve">Sam Patel übernahm das Graben, weil Sam die schwere, ehrliche Arbeit verrichtete und sie mochte. Wir standen alle im goldenen Licht der Laternen und der Lichterketten im Kreis um ihn herum, und unser Atem stieg in der Kälte gemeinsam auf. Emma Redfern hielt meine Hand auf der einen Seite, und Pip lehnte sich warm an meinen Stiefel auf der anderen. Snowball trug seine Geweihmütze. Mark stand hinter seiner Tochter und hatte die Hände auf ihren Schultern. Der ganze Kreis war anwesend, und auch Neil Carter, der länger geblieben war, als er geplant hatte, und hinten stand, wobei sein Notizbuch diesmal in seiner Tasche verstaut war. Als Sams Schaufel auf etwas stieß, das dumpf, massiv und metallisch klang, gab der gesamte Anger gleichzeitig einen Laut von sich, ein leises, erstauntes Oh, das in der kalten Luft hängen blieb.</w:t>
       </w:r>
     </w:p>
     <w:p>
@@ -4530,7 +4530,7 @@
     <w:p/>
     <w:p>
       <w:r>
-        <w:t xml:space="preserve">Eines Abends in jener Woche begleitete ich Emma und Snowball nach Hause, wobei Pip vor uns herwatschelte und Mark neben mir ging. Emma plapperte den ganzen Weg über, wie sie es mittlerweile tat, über die Kupferkiste und was sich wohl darin befinden könnte. Münzen, glaubte sie. Oder einen Brief. Oder einen Schatz, einen echten Schatz, Gold, hoffte sie, und ob denn das ganze Städtchen zuschauen dürfe, und ob sie ganz nach vorne stehen könne, wenn man die Kiste öffnete, schließlich sei sie direkt dabei gewesen, als sie aus der Erde geholt worden war, und das müsse doch schließlich etwas zählen, oder?</w:t>
+        <w:t xml:space="preserve">Eines Abends in jener Woche begleitete ich Emma und Snowball nach Hause, wobei Pip vor uns herwatschelte und Mark neben mir ging. Emma plapperte den ganzen Weg über, wie sie es mittlerweile tat, über die Kupferkiste und was sich wohl darin befinden könnte. Münzen, glaubte sie. Oder ein Brief. Oder ein Schatz, ein echter Schatz, Gold, hoffte sie, und ob denn das ganze Städtchen zuschauen dürfe, und ob sie ganz nach vorne stehen könne, wenn man die Kiste öffnete, schließlich sei sie direkt dabei gewesen, als sie aus der Erde geholt worden war, und das müsse doch schließlich etwas zählen, oder?</w:t>
       </w:r>
     </w:p>
     <w:p/>
@@ -4863,7 +4863,7 @@
     <w:p/>
     <w:p>
       <w:r>
-        <w:t>»In den Handgelenken«, sagte ich, und sie rümpfte die Nase über ihre eigenen Hände und versuchte es noch einmal.</w:t>
+        <w:t xml:space="preserve">»In den Handgelenken«, sagte ich, und sie blickte stirnrunzelnd auf ihre Hände und versuchte es erneut.</w:t>
       </w:r>
     </w:p>
     <w:p/>
@@ -4887,7 +4887,7 @@
         <w:t/>
       </w:r>
       <w:r>
-        <w:t xml:space="preserve"> schrieb, mit einem Notizbuch auf der Armlehne ihres Stuhls, weil Claire niemals ganz Feierabend hatte. Sie legte ihren Kranz immer wieder beiseite, um eine Zeile zu notieren, und nahm ihn einen Takt nach den anderen wieder auf. Ivy daneben, deren Lachen so groß und so bereitwillig war, dass der Laden heller wirkte, weil sie darin war. Sie hatte sich irgendwie Tannenreisig in die Haare gesteckt, ohne es zu merken. Martha, die pensionierte Lehrerin, seit vielen Jahren Witwe, deren kleiner weißer Hund Snowball an ihrem Knöchel schlief. Ihre Hand sank immer wieder hinab, um sein Ohr zu berühren. Um sicherzugehen, dass er noch da war. Und Ellie, gütig und unaufgeregt, die drei Tage die Woche im Krankenhaus ehrenamtlich arbeitete. Sie brachte dieselbe stetige Zärtlichkeit an einen Drahtrahmen. Ihr Kranz sah weniger gemacht als gewachsen aus.</w:t>
+        <w:t xml:space="preserve"> schrieb, mit einem Notizbuch auf der Armlehne ihres Stuhls, weil Claire niemals ganz Feierabend hatte. Sie legte ihren Kranz immer wieder beiseite, um eine Zeile zu notieren, und nahm ihn einen Takt nach den anderen wieder auf. Ivy daneben, deren Lachen so groß und so bereitwillig war, dass der Laden heller wirkte, weil sie darin war. Irgendwie hatte sie Tannennadeln in den Haaren, ohne es zu bemerken. Martha, die pensionierte Lehrerin, seit vielen Jahren Witwe, deren kleiner weißer Hund Snowball an ihrem Knöchel schlief. Ihre Hand sank immer wieder hinab, um sein Ohr zu berühren. Um sicherzugehen, dass er noch da war. Und Ellie, gütig und unaufgeregt, die drei Tage die Woche im Krankenhaus ehrenamtlich arbeitete. Sie brachte dieselbe stetige Zärtlichkeit an einen Drahtrahmen. Ihr Kranz sah weniger gemacht als gewachsen aus.</w:t>
       </w:r>
     </w:p>
     <w:p/>

</xml_diff>